<commit_message>
feat(floor): the pad asks whose check on open, and buying ships prebuilt
Opening a shared table selected nothing, so Complete answered 'Not order
Selected' while a dish-tap DID ask — the pad now asks the moment it opens and a
lone check selects itself. The bootstrap pre-builds the buying side: restaurant
supplier groups, automatic material requests at reorder level, and buying
settings that don't demand paperwork before a bill. The suites learned the
waiter gate, and the admin guide gains shared-table billing and the full
supplier-to-restock loop.
</commit_message>
<xml_diff>
--- a/docs/Etham-Admin-Guide.docx
+++ b/docs/Etham-Admin-Guide.docx
@@ -2983,13 +2983,115 @@
       </w:r>
     </w:p>
     <w:bookmarkEnd w:id="28"/>
-    <w:bookmarkStart w:id="29" w:name="money-rules-worth-knowing"/>
+    <w:bookmarkStart w:id="29" w:name="Xd9564276c13b46550da84675d043d9825190a19"/>
     <w:p>
       <w:pPr>
         <w:pStyle w:val="Heading1"/>
       </w:pPr>
       <w:r>
-        <w:t xml:space="preserve">9. Money rules worth knowing</w:t>
+        <w:t xml:space="preserve">9. Billing a shared table — four guests, four waiters, one table</w:t>
+      </w:r>
+    </w:p>
+    <w:p>
+      <w:pPr>
+        <w:pStyle w:val="FirstParagraph"/>
+      </w:pPr>
+      <w:r>
+        <w:t xml:space="preserve">The table tile shows every party:</w:t>
+      </w:r>
+      <w:r>
+        <w:t xml:space="preserve"> </w:t>
+      </w:r>
+      <w:r>
+        <w:rPr>
+          <w:rStyle w:val="VerbatimChar"/>
+        </w:rPr>
+        <w:t xml:space="preserve">7/10</w:t>
+      </w:r>
+      <w:r>
+        <w:t xml:space="preserve"> </w:t>
+      </w:r>
+      <w:r>
+        <w:t xml:space="preserve">with a badge per party (</w:t>
+      </w:r>
+      <w:r>
+        <w:rPr>
+          <w:rStyle w:val="VerbatimChar"/>
+        </w:rPr>
+        <w:t xml:space="preserve">AM·2</w:t>
+      </w:r>
+      <w:r>
+        <w:t xml:space="preserve">,</w:t>
+      </w:r>
+      <w:r>
+        <w:t xml:space="preserve"> </w:t>
+      </w:r>
+      <w:r>
+        <w:rPr>
+          <w:rStyle w:val="VerbatimChar"/>
+        </w:rPr>
+        <w:t xml:space="preserve">MO·3</w:t>
+      </w:r>
+      <w:r>
+        <w:t xml:space="preserve">…). Each party has</w:t>
+      </w:r>
+      <w:r>
+        <w:t xml:space="preserve"> </w:t>
+      </w:r>
+      <w:r>
+        <w:rPr>
+          <w:b/>
+          <w:bCs/>
+        </w:rPr>
+        <w:t xml:space="preserve">its own check, owned by the waiter who seated</w:t>
+      </w:r>
+      <w:r>
+        <w:rPr>
+          <w:b/>
+          <w:bCs/>
+        </w:rPr>
+        <w:t xml:space="preserve"> </w:t>
+      </w:r>
+      <w:r>
+        <w:rPr>
+          <w:b/>
+          <w:bCs/>
+        </w:rPr>
+        <w:t xml:space="preserve">them</w:t>
+      </w:r>
+      <w:r>
+        <w:t xml:space="preserve"> </w:t>
+      </w:r>
+      <w:r>
+        <w:t xml:space="preserve">— four different waiters on one table is normal, and</w:t>
+      </w:r>
+      <w:r>
+        <w:t xml:space="preserve"> </w:t>
+      </w:r>
+      <w:r>
+        <w:rPr>
+          <w:i/>
+          <w:iCs/>
+        </w:rPr>
+        <w:t xml:space="preserve">Sales by Waiter</w:t>
+      </w:r>
+      <w:r>
+        <w:t xml:space="preserve"> </w:t>
+      </w:r>
+      <w:r>
+        <w:t xml:space="preserve">credits each correctly.</w:t>
+      </w:r>
+    </w:p>
+    <w:p>
+      <w:pPr>
+        <w:pStyle w:val="BodyText"/>
+      </w:pPr>
+      <w:r>
+        <w:rPr>
+          <w:b/>
+          <w:bCs/>
+        </w:rPr>
+        <w:t xml:space="preserve">The cashier settles them one at a time:</w:t>
       </w:r>
     </w:p>
     <w:p>
@@ -3001,64 +3103,57 @@
         </w:numPr>
       </w:pPr>
       <w:r>
-        <w:rPr>
-          <w:b/>
-          <w:bCs/>
-        </w:rPr>
-        <w:t xml:space="preserve">Split bills</w:t>
-      </w:r>
-      <w:r>
-        <w:t xml:space="preserve">: on the check →</w:t>
-      </w:r>
-      <w:r>
-        <w:t xml:space="preserve"> </w:t>
-      </w:r>
-      <w:r>
-        <w:rPr>
-          <w:b/>
-          <w:bCs/>
-        </w:rPr>
-        <w:t xml:space="preserve">Divide</w:t>
-      </w:r>
-      <w:r>
-        <w:t xml:space="preserve"> </w:t>
-      </w:r>
-      <w:r>
-        <w:t xml:space="preserve">→ tick the items moving to the</w:t>
-      </w:r>
-      <w:r>
-        <w:t xml:space="preserve"> </w:t>
-      </w:r>
-      <w:r>
-        <w:t xml:space="preserve">new check → each check pays separately, each gets its own numbered receipt.</w:t>
-      </w:r>
-      <w:r>
-        <w:t xml:space="preserve"> </w:t>
-      </w:r>
-      <w:r>
-        <w:t xml:space="preserve">For an even split of one bill:</w:t>
-      </w:r>
-      <w:r>
-        <w:t xml:space="preserve"> </w:t>
-      </w:r>
-      <w:r>
-        <w:rPr>
-          <w:b/>
-          <w:bCs/>
-        </w:rPr>
-        <w:t xml:space="preserve">Complete</w:t>
-      </w:r>
-      <w:r>
-        <w:t xml:space="preserve"> </w:t>
-      </w:r>
-      <w:r>
-        <w:t xml:space="preserve">→ add several payment rows</w:t>
-      </w:r>
-      <w:r>
-        <w:t xml:space="preserve"> </w:t>
-      </w:r>
-      <w:r>
-        <w:t xml:space="preserve">(Cash + M-Pesa + …) on the one receipt.</w:t>
+        <w:t xml:space="preserve">Tap the table. The pad</w:t>
+      </w:r>
+      <w:r>
+        <w:t xml:space="preserve"> </w:t>
+      </w:r>
+      <w:r>
+        <w:rPr>
+          <w:b/>
+          <w:bCs/>
+        </w:rPr>
+        <w:t xml:space="preserve">asks</w:t>
+      </w:r>
+      <w:r>
+        <w:rPr>
+          <w:b/>
+          <w:bCs/>
+        </w:rPr>
+        <w:t xml:space="preserve"> </w:t>
+      </w:r>
+      <w:r>
+        <w:rPr>
+          <w:b/>
+          <w:bCs/>
+        </w:rPr>
+        <w:t xml:space="preserve">“</w:t>
+      </w:r>
+      <w:r>
+        <w:rPr>
+          <w:b/>
+          <w:bCs/>
+        </w:rPr>
+        <w:t xml:space="preserve">Whose check is this?</w:t>
+      </w:r>
+      <w:r>
+        <w:rPr>
+          <w:b/>
+          <w:bCs/>
+        </w:rPr>
+        <w:t xml:space="preserve">”</w:t>
+      </w:r>
+      <w:r>
+        <w:t xml:space="preserve"> </w:t>
+      </w:r>
+      <w:r>
+        <w:t xml:space="preserve">— every party is</w:t>
+      </w:r>
+      <w:r>
+        <w:t xml:space="preserve"> </w:t>
+      </w:r>
+      <w:r>
+        <w:t xml:space="preserve">listed with the guest’s name, covers and waiter. Pick one.</w:t>
       </w:r>
     </w:p>
     <w:p>
@@ -3074,19 +3169,19 @@
           <w:b/>
           <w:bCs/>
         </w:rPr>
-        <w:t xml:space="preserve">Release</w:t>
-      </w:r>
-      <w:r>
-        <w:t xml:space="preserve"> </w:t>
-      </w:r>
-      <w:r>
-        <w:t xml:space="preserve">(floor toolbar) voids a table’s unpaid checks and frees its</w:t>
-      </w:r>
-      <w:r>
-        <w:t xml:space="preserve"> </w:t>
-      </w:r>
-      <w:r>
-        <w:t xml:space="preserve">seats — cashier/manager only, and it never touches a paid sale.</w:t>
+        <w:t xml:space="preserve">Complete</w:t>
+      </w:r>
+      <w:r>
+        <w:t xml:space="preserve"> </w:t>
+      </w:r>
+      <w:r>
+        <w:t xml:space="preserve">→ take the payment (cash, M-Pesa, or several lines mixed) →</w:t>
+      </w:r>
+      <w:r>
+        <w:t xml:space="preserve"> </w:t>
+      </w:r>
+      <w:r>
+        <w:t xml:space="preserve">the receipt prints.</w:t>
       </w:r>
     </w:p>
     <w:p>
@@ -3098,13 +3193,85 @@
         </w:numPr>
       </w:pPr>
       <w:r>
-        <w:t xml:space="preserve">Receipts print from the pad after payment and open the print dialog</w:t>
-      </w:r>
-      <w:r>
-        <w:t xml:space="preserve"> </w:t>
-      </w:r>
-      <w:r>
-        <w:t xml:space="preserve">automatically. First time on a new tablet: allow pop-ups for the site.</w:t>
+        <w:t xml:space="preserve">Paying frees</w:t>
+      </w:r>
+      <w:r>
+        <w:t xml:space="preserve"> </w:t>
+      </w:r>
+      <w:r>
+        <w:rPr>
+          <w:b/>
+          <w:bCs/>
+        </w:rPr>
+        <w:t xml:space="preserve">only that party’s seats</w:t>
+      </w:r>
+      <w:r>
+        <w:t xml:space="preserve"> </w:t>
+      </w:r>
+      <w:r>
+        <w:t xml:space="preserve">— the tile drops from</w:t>
+      </w:r>
+      <w:r>
+        <w:t xml:space="preserve"> </w:t>
+      </w:r>
+      <w:r>
+        <w:rPr>
+          <w:rStyle w:val="VerbatimChar"/>
+        </w:rPr>
+        <w:t xml:space="preserve">7/10</w:t>
+      </w:r>
+      <w:r>
+        <w:t xml:space="preserve"> </w:t>
+      </w:r>
+      <w:r>
+        <w:t xml:space="preserve">to</w:t>
+      </w:r>
+      <w:r>
+        <w:t xml:space="preserve"> </w:t>
+      </w:r>
+      <w:r>
+        <w:rPr>
+          <w:rStyle w:val="VerbatimChar"/>
+        </w:rPr>
+        <w:t xml:space="preserve">5/10</w:t>
+      </w:r>
+      <w:r>
+        <w:t xml:space="preserve"> </w:t>
+      </w:r>
+      <w:r>
+        <w:t xml:space="preserve">and the other parties keep eating undisturbed.</w:t>
+      </w:r>
+    </w:p>
+    <w:p>
+      <w:pPr>
+        <w:pStyle w:val="Compact"/>
+        <w:numPr>
+          <w:ilvl w:val="0"/>
+          <w:numId w:val="1007"/>
+        </w:numPr>
+      </w:pPr>
+      <w:r>
+        <w:t xml:space="preserve">Tap the table again for the next party. The check chips in the pad’s left</w:t>
+      </w:r>
+      <w:r>
+        <w:t xml:space="preserve"> </w:t>
+      </w:r>
+      <w:r>
+        <w:t xml:space="preserve">rail (00001, 00002…) switch between parties at any time.</w:t>
+      </w:r>
+    </w:p>
+    <w:p>
+      <w:pPr>
+        <w:pStyle w:val="FirstParagraph"/>
+      </w:pPr>
+      <w:r>
+        <w:t xml:space="preserve">A table with a single party skips the question — its check is selected the</w:t>
+      </w:r>
+      <w:r>
+        <w:t xml:space="preserve"> </w:t>
+      </w:r>
+      <w:r>
+        <w:t xml:space="preserve">moment the pad opens.</w:t>
       </w:r>
     </w:p>
     <w:p>
@@ -3115,13 +3282,662 @@
       </w:r>
     </w:p>
     <w:bookmarkEnd w:id="29"/>
-    <w:bookmarkStart w:id="30" w:name="when-something-looks-wrong"/>
+    <w:bookmarkStart w:id="30" w:name="money-rules-worth-knowing"/>
     <w:p>
       <w:pPr>
         <w:pStyle w:val="Heading1"/>
       </w:pPr>
       <w:r>
-        <w:t xml:space="preserve">10. When something looks wrong</w:t>
+        <w:t xml:space="preserve">10. Money rules worth knowing</w:t>
+      </w:r>
+    </w:p>
+    <w:p>
+      <w:pPr>
+        <w:pStyle w:val="Compact"/>
+        <w:numPr>
+          <w:ilvl w:val="0"/>
+          <w:numId w:val="1008"/>
+        </w:numPr>
+      </w:pPr>
+      <w:r>
+        <w:rPr>
+          <w:b/>
+          <w:bCs/>
+        </w:rPr>
+        <w:t xml:space="preserve">Split bills</w:t>
+      </w:r>
+      <w:r>
+        <w:t xml:space="preserve">: on the check →</w:t>
+      </w:r>
+      <w:r>
+        <w:t xml:space="preserve"> </w:t>
+      </w:r>
+      <w:r>
+        <w:rPr>
+          <w:b/>
+          <w:bCs/>
+        </w:rPr>
+        <w:t xml:space="preserve">Divide</w:t>
+      </w:r>
+      <w:r>
+        <w:t xml:space="preserve"> </w:t>
+      </w:r>
+      <w:r>
+        <w:t xml:space="preserve">→ tick the items moving to the</w:t>
+      </w:r>
+      <w:r>
+        <w:t xml:space="preserve"> </w:t>
+      </w:r>
+      <w:r>
+        <w:t xml:space="preserve">new check → each check pays separately, each gets its own numbered receipt.</w:t>
+      </w:r>
+      <w:r>
+        <w:t xml:space="preserve"> </w:t>
+      </w:r>
+      <w:r>
+        <w:t xml:space="preserve">For an even split of one bill:</w:t>
+      </w:r>
+      <w:r>
+        <w:t xml:space="preserve"> </w:t>
+      </w:r>
+      <w:r>
+        <w:rPr>
+          <w:b/>
+          <w:bCs/>
+        </w:rPr>
+        <w:t xml:space="preserve">Complete</w:t>
+      </w:r>
+      <w:r>
+        <w:t xml:space="preserve"> </w:t>
+      </w:r>
+      <w:r>
+        <w:t xml:space="preserve">→ add several payment rows</w:t>
+      </w:r>
+      <w:r>
+        <w:t xml:space="preserve"> </w:t>
+      </w:r>
+      <w:r>
+        <w:t xml:space="preserve">(Cash + M-Pesa + …) on the one receipt.</w:t>
+      </w:r>
+    </w:p>
+    <w:p>
+      <w:pPr>
+        <w:pStyle w:val="Compact"/>
+        <w:numPr>
+          <w:ilvl w:val="0"/>
+          <w:numId w:val="1008"/>
+        </w:numPr>
+      </w:pPr>
+      <w:r>
+        <w:rPr>
+          <w:b/>
+          <w:bCs/>
+        </w:rPr>
+        <w:t xml:space="preserve">Release</w:t>
+      </w:r>
+      <w:r>
+        <w:t xml:space="preserve"> </w:t>
+      </w:r>
+      <w:r>
+        <w:t xml:space="preserve">(floor toolbar) voids a table’s unpaid checks and frees its</w:t>
+      </w:r>
+      <w:r>
+        <w:t xml:space="preserve"> </w:t>
+      </w:r>
+      <w:r>
+        <w:t xml:space="preserve">seats — cashier/manager only, and it never touches a paid sale.</w:t>
+      </w:r>
+    </w:p>
+    <w:p>
+      <w:pPr>
+        <w:pStyle w:val="Compact"/>
+        <w:numPr>
+          <w:ilvl w:val="0"/>
+          <w:numId w:val="1008"/>
+        </w:numPr>
+      </w:pPr>
+      <w:r>
+        <w:t xml:space="preserve">Receipts print from the pad after payment and open the print dialog</w:t>
+      </w:r>
+      <w:r>
+        <w:t xml:space="preserve"> </w:t>
+      </w:r>
+      <w:r>
+        <w:t xml:space="preserve">automatically. First time on a new tablet: allow pop-ups for the site.</w:t>
+      </w:r>
+    </w:p>
+    <w:p>
+      <w:r>
+        <w:pict>
+          <v:rect style="width:0;height:1.5pt" o:hralign="center" o:hrstd="t" o:hr="t"/>
+        </w:pict>
+      </w:r>
+    </w:p>
+    <w:bookmarkEnd w:id="30"/>
+    <w:bookmarkStart w:id="31" w:name="suppliers-and-reordering-the-full-loop"/>
+    <w:p>
+      <w:pPr>
+        <w:pStyle w:val="Heading1"/>
+      </w:pPr>
+      <w:r>
+        <w:t xml:space="preserve">11. Suppliers and reordering — the full loop</w:t>
+      </w:r>
+    </w:p>
+    <w:p>
+      <w:pPr>
+        <w:pStyle w:val="FirstParagraph"/>
+      </w:pPr>
+      <w:r>
+        <w:t xml:space="preserve">The system ships</w:t>
+      </w:r>
+      <w:r>
+        <w:t xml:space="preserve"> </w:t>
+      </w:r>
+      <w:r>
+        <w:rPr>
+          <w:b/>
+          <w:bCs/>
+        </w:rPr>
+        <w:t xml:space="preserve">ready to buy</w:t>
+      </w:r>
+      <w:r>
+        <w:t xml:space="preserve">: supplier shelves are pre-built (Produce,</w:t>
+      </w:r>
+      <w:r>
+        <w:t xml:space="preserve"> </w:t>
+      </w:r>
+      <w:r>
+        <w:t xml:space="preserve">Butchery &amp; Meat, Dairy, Dry Goods, Beverages, Gas &amp; Fuel, Packaging, Services)</w:t>
+      </w:r>
+      <w:r>
+        <w:t xml:space="preserve"> </w:t>
+      </w:r>
+      <w:r>
+        <w:t xml:space="preserve">and stock</w:t>
+      </w:r>
+      <w:r>
+        <w:t xml:space="preserve"> </w:t>
+      </w:r>
+      <w:r>
+        <w:rPr>
+          <w:b/>
+          <w:bCs/>
+        </w:rPr>
+        <w:t xml:space="preserve">asks to be re-bought by itself</w:t>
+      </w:r>
+      <w:r>
+        <w:t xml:space="preserve"> </w:t>
+      </w:r>
+      <w:r>
+        <w:t xml:space="preserve">the moment an ingredient dips</w:t>
+      </w:r>
+      <w:r>
+        <w:t xml:space="preserve"> </w:t>
+      </w:r>
+      <w:r>
+        <w:t xml:space="preserve">below its reorder level.</w:t>
+      </w:r>
+    </w:p>
+    <w:p>
+      <w:pPr>
+        <w:pStyle w:val="BodyText"/>
+      </w:pPr>
+      <w:r>
+        <w:rPr>
+          <w:b/>
+          <w:bCs/>
+        </w:rPr>
+        <w:t xml:space="preserve">a) Add each supplier once</w:t>
+      </w:r>
+      <w:r>
+        <w:t xml:space="preserve"> </w:t>
+      </w:r>
+      <w:r>
+        <w:t xml:space="preserve">— search</w:t>
+      </w:r>
+      <w:r>
+        <w:t xml:space="preserve"> </w:t>
+      </w:r>
+      <w:r>
+        <w:rPr>
+          <w:rStyle w:val="VerbatimChar"/>
+        </w:rPr>
+        <w:t xml:space="preserve">Supplier</w:t>
+      </w:r>
+      <w:r>
+        <w:t xml:space="preserve"> </w:t>
+      </w:r>
+      <w:r>
+        <w:t xml:space="preserve">→</w:t>
+      </w:r>
+      <w:r>
+        <w:t xml:space="preserve"> </w:t>
+      </w:r>
+      <w:r>
+        <w:rPr>
+          <w:i/>
+          <w:iCs/>
+        </w:rPr>
+        <w:t xml:space="preserve">Add</w:t>
+      </w:r>
+      <w:r>
+        <w:t xml:space="preserve">:</w:t>
+      </w:r>
+    </w:p>
+    <w:p>
+      <w:pPr>
+        <w:pStyle w:val="Compact"/>
+        <w:numPr>
+          <w:ilvl w:val="0"/>
+          <w:numId w:val="1009"/>
+        </w:numPr>
+      </w:pPr>
+      <w:r>
+        <w:t xml:space="preserve">Name, then pick the</w:t>
+      </w:r>
+      <w:r>
+        <w:t xml:space="preserve"> </w:t>
+      </w:r>
+      <w:r>
+        <w:rPr>
+          <w:b/>
+          <w:bCs/>
+        </w:rPr>
+        <w:t xml:space="preserve">Supplier Group</w:t>
+      </w:r>
+      <w:r>
+        <w:t xml:space="preserve"> </w:t>
+      </w:r>
+      <w:r>
+        <w:t xml:space="preserve">from the pre-built list.</w:t>
+      </w:r>
+    </w:p>
+    <w:p>
+      <w:pPr>
+        <w:pStyle w:val="Compact"/>
+        <w:numPr>
+          <w:ilvl w:val="0"/>
+          <w:numId w:val="1009"/>
+        </w:numPr>
+      </w:pPr>
+      <w:r>
+        <w:t xml:space="preserve">Phone/M-Pesa details under contact — that’s all a purchase needs.</w:t>
+      </w:r>
+    </w:p>
+    <w:p>
+      <w:pPr>
+        <w:pStyle w:val="FirstParagraph"/>
+      </w:pPr>
+      <w:r>
+        <w:rPr>
+          <w:b/>
+          <w:bCs/>
+        </w:rPr>
+        <w:t xml:space="preserve">b) Tell each ingredient who supplies it and when to re-buy</w:t>
+      </w:r>
+      <w:r>
+        <w:t xml:space="preserve"> </w:t>
+      </w:r>
+      <w:r>
+        <w:t xml:space="preserve">— open the</w:t>
+      </w:r>
+      <w:r>
+        <w:t xml:space="preserve"> </w:t>
+      </w:r>
+      <w:r>
+        <w:t xml:space="preserve">ingredient’s Item:</w:t>
+      </w:r>
+    </w:p>
+    <w:p>
+      <w:pPr>
+        <w:pStyle w:val="Compact"/>
+        <w:numPr>
+          <w:ilvl w:val="0"/>
+          <w:numId w:val="1010"/>
+        </w:numPr>
+      </w:pPr>
+      <w:r>
+        <w:t xml:space="preserve">Under</w:t>
+      </w:r>
+      <w:r>
+        <w:t xml:space="preserve"> </w:t>
+      </w:r>
+      <w:r>
+        <w:rPr>
+          <w:b/>
+          <w:bCs/>
+        </w:rPr>
+        <w:t xml:space="preserve">Supplier Items</w:t>
+      </w:r>
+      <w:r>
+        <w:t xml:space="preserve">: add the supplier (their item code optional).</w:t>
+      </w:r>
+    </w:p>
+    <w:p>
+      <w:pPr>
+        <w:pStyle w:val="Compact"/>
+        <w:numPr>
+          <w:ilvl w:val="0"/>
+          <w:numId w:val="1010"/>
+        </w:numPr>
+      </w:pPr>
+      <w:r>
+        <w:t xml:space="preserve">Under</w:t>
+      </w:r>
+      <w:r>
+        <w:t xml:space="preserve"> </w:t>
+      </w:r>
+      <w:r>
+        <w:rPr>
+          <w:b/>
+          <w:bCs/>
+        </w:rPr>
+        <w:t xml:space="preserve">Reorder</w:t>
+      </w:r>
+      <w:r>
+        <w:t xml:space="preserve">: warehouse</w:t>
+      </w:r>
+      <w:r>
+        <w:t xml:space="preserve"> </w:t>
+      </w:r>
+      <w:r>
+        <w:rPr>
+          <w:i/>
+          <w:iCs/>
+        </w:rPr>
+        <w:t xml:space="preserve">Stores - ETH</w:t>
+      </w:r>
+      <w:r>
+        <w:t xml:space="preserve">,</w:t>
+      </w:r>
+      <w:r>
+        <w:t xml:space="preserve"> </w:t>
+      </w:r>
+      <w:r>
+        <w:rPr>
+          <w:b/>
+          <w:bCs/>
+        </w:rPr>
+        <w:t xml:space="preserve">Reorder Level</w:t>
+      </w:r>
+      <w:r>
+        <w:t xml:space="preserve"> </w:t>
+      </w:r>
+      <w:r>
+        <w:t xml:space="preserve">(e.g. 10 kg),</w:t>
+      </w:r>
+      <w:r>
+        <w:t xml:space="preserve"> </w:t>
+      </w:r>
+      <w:r>
+        <w:rPr>
+          <w:b/>
+          <w:bCs/>
+        </w:rPr>
+        <w:t xml:space="preserve">Reorder Qty</w:t>
+      </w:r>
+      <w:r>
+        <w:t xml:space="preserve"> </w:t>
+      </w:r>
+      <w:r>
+        <w:t xml:space="preserve">(e.g. 50 kg — two bales), type</w:t>
+      </w:r>
+      <w:r>
+        <w:t xml:space="preserve"> </w:t>
+      </w:r>
+      <w:r>
+        <w:rPr>
+          <w:i/>
+          <w:iCs/>
+        </w:rPr>
+        <w:t xml:space="preserve">Purchase</w:t>
+      </w:r>
+      <w:r>
+        <w:t xml:space="preserve">.</w:t>
+      </w:r>
+    </w:p>
+    <w:p>
+      <w:pPr>
+        <w:pStyle w:val="FirstParagraph"/>
+      </w:pPr>
+      <w:r>
+        <w:rPr>
+          <w:b/>
+          <w:bCs/>
+        </w:rPr>
+        <w:t xml:space="preserve">c) From there the loop runs itself:</w:t>
+      </w:r>
+    </w:p>
+    <w:p>
+      <w:pPr>
+        <w:pStyle w:val="Compact"/>
+        <w:numPr>
+          <w:ilvl w:val="0"/>
+          <w:numId w:val="1011"/>
+        </w:numPr>
+      </w:pPr>
+      <w:r>
+        <w:t xml:space="preserve">Sales consume stock through the recipes (section 5).</w:t>
+      </w:r>
+    </w:p>
+    <w:p>
+      <w:pPr>
+        <w:pStyle w:val="Compact"/>
+        <w:numPr>
+          <w:ilvl w:val="0"/>
+          <w:numId w:val="1011"/>
+        </w:numPr>
+      </w:pPr>
+      <w:r>
+        <w:t xml:space="preserve">The moment flour dips below 10 kg, the system raises a</w:t>
+      </w:r>
+      <w:r>
+        <w:t xml:space="preserve"> </w:t>
+      </w:r>
+      <w:r>
+        <w:rPr>
+          <w:b/>
+          <w:bCs/>
+        </w:rPr>
+        <w:t xml:space="preserve">Material Request</w:t>
+      </w:r>
+      <w:r>
+        <w:t xml:space="preserve"> </w:t>
+      </w:r>
+      <w:r>
+        <w:t xml:space="preserve">overnight — no one types anything.</w:t>
+      </w:r>
+    </w:p>
+    <w:p>
+      <w:pPr>
+        <w:pStyle w:val="Compact"/>
+        <w:numPr>
+          <w:ilvl w:val="0"/>
+          <w:numId w:val="1011"/>
+        </w:numPr>
+      </w:pPr>
+      <w:r>
+        <w:t xml:space="preserve">Morning routine: search</w:t>
+      </w:r>
+      <w:r>
+        <w:t xml:space="preserve"> </w:t>
+      </w:r>
+      <w:r>
+        <w:rPr>
+          <w:rStyle w:val="VerbatimChar"/>
+        </w:rPr>
+        <w:t xml:space="preserve">Material Request</w:t>
+      </w:r>
+      <w:r>
+        <w:t xml:space="preserve"> </w:t>
+      </w:r>
+      <w:r>
+        <w:t xml:space="preserve">→ open the day’s requests →</w:t>
+      </w:r>
+      <w:r>
+        <w:t xml:space="preserve"> </w:t>
+      </w:r>
+      <w:r>
+        <w:rPr>
+          <w:b/>
+          <w:bCs/>
+        </w:rPr>
+        <w:t xml:space="preserve">Create → Purchase Order</w:t>
+      </w:r>
+      <w:r>
+        <w:t xml:space="preserve"> </w:t>
+      </w:r>
+      <w:r>
+        <w:t xml:space="preserve">— supplier and quantities are pre-filled from</w:t>
+      </w:r>
+      <w:r>
+        <w:t xml:space="preserve"> </w:t>
+      </w:r>
+      <w:r>
+        <w:t xml:space="preserve">(b). One order per supplier, a few taps.</w:t>
+      </w:r>
+    </w:p>
+    <w:p>
+      <w:pPr>
+        <w:pStyle w:val="Compact"/>
+        <w:numPr>
+          <w:ilvl w:val="0"/>
+          <w:numId w:val="1011"/>
+        </w:numPr>
+      </w:pPr>
+      <w:r>
+        <w:t xml:space="preserve">Goods arrive: open the PO →</w:t>
+      </w:r>
+      <w:r>
+        <w:t xml:space="preserve"> </w:t>
+      </w:r>
+      <w:r>
+        <w:rPr>
+          <w:b/>
+          <w:bCs/>
+        </w:rPr>
+        <w:t xml:space="preserve">Create → Purchase Receipt</w:t>
+      </w:r>
+      <w:r>
+        <w:t xml:space="preserve"> </w:t>
+      </w:r>
+      <w:r>
+        <w:t xml:space="preserve">→ confirm counts →</w:t>
+      </w:r>
+      <w:r>
+        <w:t xml:space="preserve"> </w:t>
+      </w:r>
+      <w:r>
+        <w:t xml:space="preserve">Submit.</w:t>
+      </w:r>
+      <w:r>
+        <w:t xml:space="preserve"> </w:t>
+      </w:r>
+      <w:r>
+        <w:rPr>
+          <w:b/>
+          <w:bCs/>
+        </w:rPr>
+        <w:t xml:space="preserve">Stock goes up, valuation updates</w:t>
+      </w:r>
+      <w:r>
+        <w:t xml:space="preserve"> </w:t>
+      </w:r>
+      <w:r>
+        <w:t xml:space="preserve">— the bale is now 25 counted kg.</w:t>
+      </w:r>
+    </w:p>
+    <w:p>
+      <w:pPr>
+        <w:pStyle w:val="Compact"/>
+        <w:numPr>
+          <w:ilvl w:val="0"/>
+          <w:numId w:val="1011"/>
+        </w:numPr>
+      </w:pPr>
+      <w:r>
+        <w:t xml:space="preserve">The supplier’s bill: PO →</w:t>
+      </w:r>
+      <w:r>
+        <w:t xml:space="preserve"> </w:t>
+      </w:r>
+      <w:r>
+        <w:rPr>
+          <w:b/>
+          <w:bCs/>
+        </w:rPr>
+        <w:t xml:space="preserve">Create → Purchase Invoice</w:t>
+      </w:r>
+      <w:r>
+        <w:t xml:space="preserve"> </w:t>
+      </w:r>
+      <w:r>
+        <w:t xml:space="preserve">→ Submit when paid.</w:t>
+      </w:r>
+      <w:r>
+        <w:t xml:space="preserve"> </w:t>
+      </w:r>
+      <w:r>
+        <w:t xml:space="preserve">Supplier statements live at</w:t>
+      </w:r>
+      <w:r>
+        <w:t xml:space="preserve"> </w:t>
+      </w:r>
+      <w:r>
+        <w:rPr>
+          <w:rStyle w:val="VerbatimChar"/>
+        </w:rPr>
+        <w:t xml:space="preserve">Accounts Payable</w:t>
+      </w:r>
+      <w:r>
+        <w:t xml:space="preserve">.</w:t>
+      </w:r>
+    </w:p>
+    <w:p>
+      <w:pPr>
+        <w:pStyle w:val="FirstParagraph"/>
+      </w:pPr>
+      <w:r>
+        <w:rPr>
+          <w:b/>
+          <w:bCs/>
+        </w:rPr>
+        <w:t xml:space="preserve">Restock List</w:t>
+      </w:r>
+      <w:r>
+        <w:t xml:space="preserve"> </w:t>
+      </w:r>
+      <w:r>
+        <w:t xml:space="preserve">(section 3) stays the manager’s daily glance: everything</w:t>
+      </w:r>
+      <w:r>
+        <w:t xml:space="preserve"> </w:t>
+      </w:r>
+      <w:r>
+        <w:t xml:space="preserve">under its level, how short, and who supplies it — the same list the automatic</w:t>
+      </w:r>
+      <w:r>
+        <w:t xml:space="preserve"> </w:t>
+      </w:r>
+      <w:r>
+        <w:t xml:space="preserve">requests are built from.</w:t>
+      </w:r>
+    </w:p>
+    <w:p>
+      <w:r>
+        <w:pict>
+          <v:rect style="width:0;height:1.5pt" o:hralign="center" o:hrstd="t" o:hr="t"/>
+        </w:pict>
+      </w:r>
+    </w:p>
+    <w:bookmarkEnd w:id="31"/>
+    <w:bookmarkStart w:id="32" w:name="when-something-looks-wrong"/>
+    <w:p>
+      <w:pPr>
+        <w:pStyle w:val="Heading1"/>
+      </w:pPr>
+      <w:r>
+        <w:t xml:space="preserve">12. When something looks wrong</w:t>
       </w:r>
     </w:p>
     <w:tbl>
@@ -3244,6 +4060,59 @@
               <w:jc w:val="left"/>
             </w:pPr>
             <w:r>
+              <w:t xml:space="preserve">Cashier taps Complete, gets</w:t>
+            </w:r>
+            <w:r>
+              <w:t xml:space="preserve"> </w:t>
+            </w:r>
+            <w:r>
+              <w:t xml:space="preserve">“</w:t>
+            </w:r>
+            <w:r>
+              <w:t xml:space="preserve">Not order Selected</w:t>
+            </w:r>
+            <w:r>
+              <w:t xml:space="preserve">”</w:t>
+            </w:r>
+          </w:p>
+        </w:tc>
+        <w:tc>
+          <w:tcPr/>
+          <w:p>
+            <w:pPr>
+              <w:pStyle w:val="Compact"/>
+              <w:jc w:val="left"/>
+            </w:pPr>
+            <w:r>
+              <w:t xml:space="preserve">No check picked on a shared table — tap the table again and answer</w:t>
+            </w:r>
+            <w:r>
+              <w:t xml:space="preserve"> </w:t>
+            </w:r>
+            <w:r>
+              <w:t xml:space="preserve">“</w:t>
+            </w:r>
+            <w:r>
+              <w:t xml:space="preserve">Whose check?</w:t>
+            </w:r>
+            <w:r>
+              <w:t xml:space="preserve">”</w:t>
+            </w:r>
+            <w:r>
+              <w:t xml:space="preserve">, or tap the check chip in the left rail.</w:t>
+            </w:r>
+          </w:p>
+        </w:tc>
+      </w:tr>
+      <w:tr>
+        <w:tc>
+          <w:tcPr/>
+          <w:p>
+            <w:pPr>
+              <w:pStyle w:val="Compact"/>
+              <w:jc w:val="left"/>
+            </w:pPr>
+            <w:r>
               <w:t xml:space="preserve">A dish is missing from the pad</w:t>
             </w:r>
           </w:p>
@@ -3445,7 +4314,7 @@
         <w:t xml:space="preserve">looks wrong.</w:t>
       </w:r>
     </w:p>
-    <w:bookmarkEnd w:id="30"/>
+    <w:bookmarkEnd w:id="32"/>
     <w:sectPr/>
   </w:body>
 </w:document>
@@ -3870,7 +4739,127 @@
     </w:lvlOverride>
   </w:num>
   <w:num w:numId="1007">
+    <w:abstractNumId w:val="99411"/>
+    <w:lvlOverride w:ilvl="0">
+      <w:startOverride w:val="1"/>
+    </w:lvlOverride>
+    <w:lvlOverride w:ilvl="1">
+      <w:startOverride w:val="1"/>
+    </w:lvlOverride>
+    <w:lvlOverride w:ilvl="2">
+      <w:startOverride w:val="1"/>
+    </w:lvlOverride>
+    <w:lvlOverride w:ilvl="3">
+      <w:startOverride w:val="1"/>
+    </w:lvlOverride>
+    <w:lvlOverride w:ilvl="4">
+      <w:startOverride w:val="1"/>
+    </w:lvlOverride>
+    <w:lvlOverride w:ilvl="5">
+      <w:startOverride w:val="1"/>
+    </w:lvlOverride>
+    <w:lvlOverride w:ilvl="6">
+      <w:startOverride w:val="1"/>
+    </w:lvlOverride>
+    <w:lvlOverride w:ilvl="7">
+      <w:startOverride w:val="1"/>
+    </w:lvlOverride>
+    <w:lvlOverride w:ilvl="8">
+      <w:startOverride w:val="1"/>
+    </w:lvlOverride>
+  </w:num>
+  <w:num w:numId="1008">
     <w:abstractNumId w:val="991"/>
+  </w:num>
+  <w:num w:numId="1009">
+    <w:abstractNumId w:val="99411"/>
+    <w:lvlOverride w:ilvl="0">
+      <w:startOverride w:val="1"/>
+    </w:lvlOverride>
+    <w:lvlOverride w:ilvl="1">
+      <w:startOverride w:val="1"/>
+    </w:lvlOverride>
+    <w:lvlOverride w:ilvl="2">
+      <w:startOverride w:val="1"/>
+    </w:lvlOverride>
+    <w:lvlOverride w:ilvl="3">
+      <w:startOverride w:val="1"/>
+    </w:lvlOverride>
+    <w:lvlOverride w:ilvl="4">
+      <w:startOverride w:val="1"/>
+    </w:lvlOverride>
+    <w:lvlOverride w:ilvl="5">
+      <w:startOverride w:val="1"/>
+    </w:lvlOverride>
+    <w:lvlOverride w:ilvl="6">
+      <w:startOverride w:val="1"/>
+    </w:lvlOverride>
+    <w:lvlOverride w:ilvl="7">
+      <w:startOverride w:val="1"/>
+    </w:lvlOverride>
+    <w:lvlOverride w:ilvl="8">
+      <w:startOverride w:val="1"/>
+    </w:lvlOverride>
+  </w:num>
+  <w:num w:numId="1010">
+    <w:abstractNumId w:val="99411"/>
+    <w:lvlOverride w:ilvl="0">
+      <w:startOverride w:val="1"/>
+    </w:lvlOverride>
+    <w:lvlOverride w:ilvl="1">
+      <w:startOverride w:val="1"/>
+    </w:lvlOverride>
+    <w:lvlOverride w:ilvl="2">
+      <w:startOverride w:val="1"/>
+    </w:lvlOverride>
+    <w:lvlOverride w:ilvl="3">
+      <w:startOverride w:val="1"/>
+    </w:lvlOverride>
+    <w:lvlOverride w:ilvl="4">
+      <w:startOverride w:val="1"/>
+    </w:lvlOverride>
+    <w:lvlOverride w:ilvl="5">
+      <w:startOverride w:val="1"/>
+    </w:lvlOverride>
+    <w:lvlOverride w:ilvl="6">
+      <w:startOverride w:val="1"/>
+    </w:lvlOverride>
+    <w:lvlOverride w:ilvl="7">
+      <w:startOverride w:val="1"/>
+    </w:lvlOverride>
+    <w:lvlOverride w:ilvl="8">
+      <w:startOverride w:val="1"/>
+    </w:lvlOverride>
+  </w:num>
+  <w:num w:numId="1011">
+    <w:abstractNumId w:val="99411"/>
+    <w:lvlOverride w:ilvl="0">
+      <w:startOverride w:val="1"/>
+    </w:lvlOverride>
+    <w:lvlOverride w:ilvl="1">
+      <w:startOverride w:val="1"/>
+    </w:lvlOverride>
+    <w:lvlOverride w:ilvl="2">
+      <w:startOverride w:val="1"/>
+    </w:lvlOverride>
+    <w:lvlOverride w:ilvl="3">
+      <w:startOverride w:val="1"/>
+    </w:lvlOverride>
+    <w:lvlOverride w:ilvl="4">
+      <w:startOverride w:val="1"/>
+    </w:lvlOverride>
+    <w:lvlOverride w:ilvl="5">
+      <w:startOverride w:val="1"/>
+    </w:lvlOverride>
+    <w:lvlOverride w:ilvl="6">
+      <w:startOverride w:val="1"/>
+    </w:lvlOverride>
+    <w:lvlOverride w:ilvl="7">
+      <w:startOverride w:val="1"/>
+    </w:lvlOverride>
+    <w:lvlOverride w:ilvl="8">
+      <w:startOverride w:val="1"/>
+    </w:lvlOverride>
   </w:num>
 </w:numbering>
 </file>

</xml_diff>

<commit_message>
docs: devices log in once, people use PINs — and mind the hidden typo
The question that prompted it: a PIN set through the masked field saved as a
different number than the owner believed. The guide now says to use the eye
icon, and spells out the two identity layers.
</commit_message>
<xml_diff>
--- a/docs/Etham-Admin-Guide.docx
+++ b/docs/Etham-Admin-Guide.docx
@@ -2826,6 +2826,204 @@
         </w:tc>
       </w:tr>
     </w:tbl>
+    <w:p>
+      <w:pPr>
+        <w:pStyle w:val="BodyText"/>
+      </w:pPr>
+      <w:r>
+        <w:rPr>
+          <w:b/>
+          <w:bCs/>
+        </w:rPr>
+        <w:t xml:space="preserve">Two layers, and only devices log in.</w:t>
+      </w:r>
+      <w:r>
+        <w:t xml:space="preserve"> </w:t>
+      </w:r>
+      <w:r>
+        <w:t xml:space="preserve">Each tablet or screen signs into the</w:t>
+      </w:r>
+      <w:r>
+        <w:t xml:space="preserve"> </w:t>
+      </w:r>
+      <w:r>
+        <w:t xml:space="preserve">site</w:t>
+      </w:r>
+      <w:r>
+        <w:t xml:space="preserve"> </w:t>
+      </w:r>
+      <w:r>
+        <w:rPr>
+          <w:b/>
+          <w:bCs/>
+        </w:rPr>
+        <w:t xml:space="preserve">once</w:t>
+      </w:r>
+      <w:r>
+        <w:t xml:space="preserve"> </w:t>
+      </w:r>
+      <w:r>
+        <w:t xml:space="preserve">with its station account and stays signed in: waiter tablets as</w:t>
+      </w:r>
+      <w:r>
+        <w:t xml:space="preserve"> </w:t>
+      </w:r>
+      <w:r>
+        <w:rPr>
+          <w:rStyle w:val="VerbatimChar"/>
+        </w:rPr>
+        <w:t xml:space="preserve">waiter@</w:t>
+      </w:r>
+      <w:r>
+        <w:t xml:space="preserve">, the kitchen screen as</w:t>
+      </w:r>
+      <w:r>
+        <w:t xml:space="preserve"> </w:t>
+      </w:r>
+      <w:r>
+        <w:rPr>
+          <w:rStyle w:val="VerbatimChar"/>
+        </w:rPr>
+        <w:t xml:space="preserve">kitchen@</w:t>
+      </w:r>
+      <w:r>
+        <w:t xml:space="preserve">, the till as</w:t>
+      </w:r>
+      <w:r>
+        <w:t xml:space="preserve"> </w:t>
+      </w:r>
+      <w:r>
+        <w:rPr>
+          <w:rStyle w:val="VerbatimChar"/>
+        </w:rPr>
+        <w:t xml:space="preserve">cashier@</w:t>
+      </w:r>
+      <w:r>
+        <w:t xml:space="preserve">. The</w:t>
+      </w:r>
+      <w:r>
+        <w:t xml:space="preserve"> </w:t>
+      </w:r>
+      <w:r>
+        <w:rPr>
+          <w:b/>
+          <w:bCs/>
+        </w:rPr>
+        <w:t xml:space="preserve">people</w:t>
+      </w:r>
+      <w:r>
+        <w:t xml:space="preserve"> </w:t>
+      </w:r>
+      <w:r>
+        <w:t xml:space="preserve">never log in — a waiter identifies on the shared tablet with their</w:t>
+      </w:r>
+      <w:r>
+        <w:t xml:space="preserve"> </w:t>
+      </w:r>
+      <w:r>
+        <w:t xml:space="preserve">name + PIN (floor →</w:t>
+      </w:r>
+      <w:r>
+        <w:t xml:space="preserve"> </w:t>
+      </w:r>
+      <w:r>
+        <w:rPr>
+          <w:i/>
+          <w:iCs/>
+        </w:rPr>
+        <w:t xml:space="preserve">Waiter</w:t>
+      </w:r>
+      <w:r>
+        <w:t xml:space="preserve">), once per shift. That PIN is what puts their name</w:t>
+      </w:r>
+      <w:r>
+        <w:t xml:space="preserve"> </w:t>
+      </w:r>
+      <w:r>
+        <w:t xml:space="preserve">on parties, orders and the sales report. Kitchen and cashier need no PIN — the</w:t>
+      </w:r>
+      <w:r>
+        <w:t xml:space="preserve"> </w:t>
+      </w:r>
+      <w:r>
+        <w:t xml:space="preserve">station login is their identity.</w:t>
+      </w:r>
+    </w:p>
+    <w:p>
+      <w:pPr>
+        <w:pStyle w:val="BodyText"/>
+      </w:pPr>
+      <w:r>
+        <w:t xml:space="preserve">When setting a PIN on the Restaurant Waiter form, the field shows dots — tap</w:t>
+      </w:r>
+      <w:r>
+        <w:t xml:space="preserve"> </w:t>
+      </w:r>
+      <w:r>
+        <w:t xml:space="preserve">the</w:t>
+      </w:r>
+      <w:r>
+        <w:t xml:space="preserve"> </w:t>
+      </w:r>
+      <w:r>
+        <w:rPr>
+          <w:b/>
+          <w:bCs/>
+        </w:rPr>
+        <w:t xml:space="preserve">eye icon</w:t>
+      </w:r>
+      <w:r>
+        <w:t xml:space="preserve"> </w:t>
+      </w:r>
+      <w:r>
+        <w:t xml:space="preserve">to see what you typed before saving; a hidden typo is the</w:t>
+      </w:r>
+      <w:r>
+        <w:t xml:space="preserve"> </w:t>
+      </w:r>
+      <w:r>
+        <w:t xml:space="preserve">usual cause of</w:t>
+      </w:r>
+      <w:r>
+        <w:t xml:space="preserve"> </w:t>
+      </w:r>
+      <w:r>
+        <w:t xml:space="preserve">“</w:t>
+      </w:r>
+      <w:r>
+        <w:t xml:space="preserve">Wrong PIN</w:t>
+      </w:r>
+      <w:r>
+        <w:t xml:space="preserve">”</w:t>
+      </w:r>
+      <w:r>
+        <w:t xml:space="preserve">. (The little</w:t>
+      </w:r>
+      <w:r>
+        <w:t xml:space="preserve"> </w:t>
+      </w:r>
+      <w:r>
+        <w:t xml:space="preserve">“</w:t>
+      </w:r>
+      <w:r>
+        <w:t xml:space="preserve">Weak</w:t>
+      </w:r>
+      <w:r>
+        <w:t xml:space="preserve">”</w:t>
+      </w:r>
+      <w:r>
+        <w:t xml:space="preserve"> </w:t>
+      </w:r>
+      <w:r>
+        <w:t xml:space="preserve">meter next to the PIN is</w:t>
+      </w:r>
+      <w:r>
+        <w:t xml:space="preserve"> </w:t>
+      </w:r>
+      <w:r>
+        <w:t xml:space="preserve">cosmetic — a 4-digit PIN is expected.)</w:t>
+      </w:r>
+    </w:p>
     <w:p>
       <w:pPr>
         <w:pStyle w:val="BodyText"/>

</xml_diff>

<commit_message>
docs: handover state, the manager account, and three new traps
Geff's account and Room 2's tables, the station roles that must not include
Restaurant Manager, the Supplier and BOM roles the guide assumes, and the
purge of the test books — plus the three traps that cost this session.
</commit_message>
<xml_diff>
--- a/docs/Etham-Admin-Guide.docx
+++ b/docs/Etham-Admin-Guide.docx
@@ -110,32 +110,6 @@
         <w:t xml:space="preserve">2026</w:t>
       </w:r>
     </w:p>
-    <w:sdt>
-      <w:sdtPr>
-        <w:docPartObj>
-          <w:docPartGallery w:val="Table of Contents"/>
-          <w:docPartUnique/>
-        </w:docPartObj>
-      </w:sdtPr>
-      <w:sdtContent>
-        <w:p>
-          <w:pPr>
-            <w:pStyle w:val="TOCHeading"/>
-          </w:pPr>
-          <w:r>
-            <w:t xml:space="preserve">Table of Contents</w:t>
-          </w:r>
-        </w:p>
-        <w:p>
-          <w:r>
-            <w:fldChar w:fldCharType="begin" w:dirty="true"/>
-            <w:instrText xml:space="preserve">TOC \o "1-1" \h \z \u</w:instrText>
-            <w:fldChar w:fldCharType="separate"/>
-            <w:fldChar w:fldCharType="end"/>
-          </w:r>
-        </w:p>
-      </w:sdtContent>
-    </w:sdt>
     <w:bookmarkStart w:id="20" w:name="how-to-use-this-guide"/>
     <w:p>
       <w:pPr>
@@ -1259,6 +1233,83 @@
           <w:b/>
           <w:bCs/>
         </w:rPr>
+        <w:t xml:space="preserve">On the order pad</w:t>
+      </w:r>
+      <w:r>
+        <w:t xml:space="preserve"> </w:t>
+      </w:r>
+      <w:r>
+        <w:t xml:space="preserve">every dish is a card: photo, name, price, and a</w:t>
+      </w:r>
+      <w:r>
+        <w:t xml:space="preserve"> </w:t>
+      </w:r>
+      <w:r>
+        <w:rPr>
+          <w:rStyle w:val="VerbatimChar"/>
+        </w:rPr>
+        <w:t xml:space="preserve">− n +</w:t>
+      </w:r>
+      <w:r>
+        <w:t xml:space="preserve"> </w:t>
+      </w:r>
+      <w:r>
+        <w:t xml:space="preserve">pill.</w:t>
+      </w:r>
+      <w:r>
+        <w:t xml:space="preserve"> </w:t>
+      </w:r>
+      <w:r>
+        <w:rPr>
+          <w:b/>
+          <w:bCs/>
+        </w:rPr>
+        <w:t xml:space="preserve">+</w:t>
+      </w:r>
+      <w:r>
+        <w:t xml:space="preserve"> </w:t>
+      </w:r>
+      <w:r>
+        <w:t xml:space="preserve">puts one on the check (the pill turns green and counts),</w:t>
+      </w:r>
+      <w:r>
+        <w:t xml:space="preserve"> </w:t>
+      </w:r>
+      <w:r>
+        <w:rPr>
+          <w:b/>
+          <w:bCs/>
+        </w:rPr>
+        <w:t xml:space="preserve">−</w:t>
+      </w:r>
+      <w:r>
+        <w:t xml:space="preserve"> </w:t>
+      </w:r>
+      <w:r>
+        <w:t xml:space="preserve">takes</w:t>
+      </w:r>
+      <w:r>
+        <w:t xml:space="preserve"> </w:t>
+      </w:r>
+      <w:r>
+        <w:t xml:space="preserve">one off. The number on the pill is what is on the check right now, so a waiter</w:t>
+      </w:r>
+      <w:r>
+        <w:t xml:space="preserve"> </w:t>
+      </w:r>
+      <w:r>
+        <w:t xml:space="preserve">can see at a glance what this table has ordered from each card.</w:t>
+      </w:r>
+    </w:p>
+    <w:p>
+      <w:pPr>
+        <w:pStyle w:val="BodyText"/>
+      </w:pPr>
+      <w:r>
+        <w:rPr>
+          <w:b/>
+          <w:bCs/>
+        </w:rPr>
         <w:t xml:space="preserve">Rules that save you a phone call:</w:t>
       </w:r>
     </w:p>
@@ -1671,7 +1722,55 @@
         <w:t xml:space="preserve">Add BOM</w:t>
       </w:r>
       <w:r>
-        <w:t xml:space="preserve">:</w:t>
+        <w:t xml:space="preserve"> </w:t>
+      </w:r>
+      <w:r>
+        <w:t xml:space="preserve">(needs the</w:t>
+      </w:r>
+      <w:r>
+        <w:t xml:space="preserve"> </w:t>
+      </w:r>
+      <w:r>
+        <w:rPr>
+          <w:rStyle w:val="VerbatimChar"/>
+        </w:rPr>
+        <w:t xml:space="preserve">Manufacturing Manager</w:t>
+      </w:r>
+      <w:r>
+        <w:t xml:space="preserve"> </w:t>
+      </w:r>
+      <w:r>
+        <w:t xml:space="preserve">role —</w:t>
+      </w:r>
+      <w:r>
+        <w:t xml:space="preserve"> </w:t>
+      </w:r>
+      <w:r>
+        <w:rPr>
+          <w:rStyle w:val="VerbatimChar"/>
+        </w:rPr>
+        <w:t xml:space="preserve">admin@</w:t>
+      </w:r>
+      <w:r>
+        <w:t xml:space="preserve"> </w:t>
+      </w:r>
+      <w:r>
+        <w:t xml:space="preserve">and</w:t>
+      </w:r>
+      <w:r>
+        <w:t xml:space="preserve"> </w:t>
+      </w:r>
+      <w:r>
+        <w:rPr>
+          <w:rStyle w:val="VerbatimChar"/>
+        </w:rPr>
+        <w:t xml:space="preserve">geff@</w:t>
+      </w:r>
+      <w:r>
+        <w:t xml:space="preserve"> </w:t>
+      </w:r>
+      <w:r>
+        <w:t xml:space="preserve">have it):</w:t>
       </w:r>
     </w:p>
     <w:p>
@@ -2661,7 +2760,7 @@
               <w:jc w:val="left"/>
             </w:pPr>
             <w:r>
-              <w:t xml:space="preserve">take money, open/close day, void tables, edit menu</w:t>
+              <w:t xml:space="preserve">take money, open/close day, void tables, add or delete tables, edit menu</w:t>
             </w:r>
           </w:p>
         </w:tc>
@@ -2755,7 +2854,7 @@
               <w:jc w:val="left"/>
             </w:pPr>
             <w:r>
-              <w:t xml:space="preserve">payments, open/close day, release tables</w:t>
+              <w:t xml:space="preserve">payments, open/close day, release tables, edit the floor plan</w:t>
             </w:r>
           </w:p>
         </w:tc>
@@ -2768,6 +2867,59 @@
             </w:pPr>
             <w:r>
               <w:t xml:space="preserve">edit the menu</w:t>
+            </w:r>
+          </w:p>
+        </w:tc>
+      </w:tr>
+      <w:tr>
+        <w:tc>
+          <w:tcPr/>
+          <w:p>
+            <w:pPr>
+              <w:pStyle w:val="Compact"/>
+              <w:jc w:val="left"/>
+            </w:pPr>
+            <w:r>
+              <w:rPr>
+                <w:rStyle w:val="VerbatimChar"/>
+              </w:rPr>
+              <w:t xml:space="preserve">geff@etham.co.ke</w:t>
+            </w:r>
+          </w:p>
+        </w:tc>
+        <w:tc>
+          <w:tcPr/>
+          <w:p>
+            <w:pPr>
+              <w:pStyle w:val="Compact"/>
+              <w:jc w:val="left"/>
+            </w:pPr>
+            <w:r>
+              <w:t xml:space="preserve">Geff, the manager</w:t>
+            </w:r>
+          </w:p>
+        </w:tc>
+        <w:tc>
+          <w:tcPr/>
+          <w:p>
+            <w:pPr>
+              <w:pStyle w:val="Compact"/>
+              <w:jc w:val="left"/>
+            </w:pPr>
+            <w:r>
+              <w:t xml:space="preserve">everything in this guide — menu, recipes, stock, suppliers, staff, reports, the day</w:t>
+            </w:r>
+          </w:p>
+        </w:tc>
+        <w:tc>
+          <w:tcPr/>
+          <w:p>
+            <w:pPr>
+              <w:pStyle w:val="Compact"/>
+              <w:jc w:val="left"/>
+            </w:pPr>
+            <w:r>
+              <w:t xml:space="preserve">change system settings or other users’ roles</w:t>
             </w:r>
           </w:p>
         </w:tc>
@@ -3720,6 +3872,75 @@
       </w:r>
       <w:r>
         <w:t xml:space="preserve">:</w:t>
+      </w:r>
+    </w:p>
+    <w:p>
+      <w:pPr>
+        <w:pStyle w:val="BlockText"/>
+      </w:pPr>
+      <w:r>
+        <w:t xml:space="preserve">If a new user cannot see</w:t>
+      </w:r>
+      <w:r>
+        <w:t xml:space="preserve"> </w:t>
+      </w:r>
+      <w:r>
+        <w:rPr>
+          <w:i/>
+          <w:iCs/>
+        </w:rPr>
+        <w:t xml:space="preserve">Add</w:t>
+      </w:r>
+      <w:r>
+        <w:t xml:space="preserve"> </w:t>
+      </w:r>
+      <w:r>
+        <w:t xml:space="preserve">on the Supplier list, they are missing the</w:t>
+      </w:r>
+      <w:r>
+        <w:t xml:space="preserve"> </w:t>
+      </w:r>
+      <w:r>
+        <w:rPr>
+          <w:rStyle w:val="VerbatimChar"/>
+        </w:rPr>
+        <w:t xml:space="preserve">Purchase Master Manager</w:t>
+      </w:r>
+      <w:r>
+        <w:t xml:space="preserve"> </w:t>
+      </w:r>
+      <w:r>
+        <w:t xml:space="preserve">role;</w:t>
+      </w:r>
+      <w:r>
+        <w:t xml:space="preserve"> </w:t>
+      </w:r>
+      <w:r>
+        <w:rPr>
+          <w:rStyle w:val="VerbatimChar"/>
+        </w:rPr>
+        <w:t xml:space="preserve">admin@</w:t>
+      </w:r>
+      <w:r>
+        <w:t xml:space="preserve"> </w:t>
+      </w:r>
+      <w:r>
+        <w:t xml:space="preserve">and</w:t>
+      </w:r>
+      <w:r>
+        <w:t xml:space="preserve"> </w:t>
+      </w:r>
+      <w:r>
+        <w:rPr>
+          <w:rStyle w:val="VerbatimChar"/>
+        </w:rPr>
+        <w:t xml:space="preserve">geff@</w:t>
+      </w:r>
+      <w:r>
+        <w:t xml:space="preserve"> </w:t>
+      </w:r>
+      <w:r>
+        <w:t xml:space="preserve">already have it.</w:t>
       </w:r>
     </w:p>
     <w:p>
@@ -5070,7 +5291,7 @@
         <w:rFonts w:asciiTheme="minorHAnsi" w:cstheme="minorBidi" w:eastAsiaTheme="minorHAnsi" w:hAnsiTheme="minorHAnsi"/>
         <w:sz w:val="24"/>
         <w:szCs w:val="24"/>
-        <w:lang w:bidi="ar-SA" w:eastAsia="en-US" w:val="en"/>
+        <w:lang w:bidi="ar-SA" w:eastAsia="en-US" w:val="en-US"/>
       </w:rPr>
     </w:rPrDefault>
     <w:pPrDefault>

</xml_diff>

<commit_message>
feat: Enhance delivery management and menu rendering - Implemented end-to-end delivery testing with a new delivery drill script. - Updated card rendering logic to ensure all menu items are displayed without phantom spacers. - Added delivery address handling in the host stand and ensured proper fee application on delivery orders. - Enhanced the sales report by waiter to include filtering by delivery room. - Improved the resizing functionality of floor tiles with clearer UI handles. - Added CSS styles for resize handles to improve visibility and usability. - Introduced a new patch for managing delivery tickets, ensuring correct fee application and address handling. - Created tests to validate menu management and delivery processes.
</commit_message>
<xml_diff>
--- a/docs/Etham-Admin-Guide.docx
+++ b/docs/Etham-Admin-Guide.docx
@@ -4350,13 +4350,412 @@
       </w:r>
     </w:p>
     <w:bookmarkEnd w:id="31"/>
-    <w:bookmarkStart w:id="32" w:name="when-something-looks-wrong"/>
+    <w:bookmarkStart w:id="32" w:name="X8fcaa7551dda54495526d9fae00de885002f969"/>
     <w:p>
       <w:pPr>
         <w:pStyle w:val="Heading1"/>
       </w:pPr>
       <w:r>
-        <w:t xml:space="preserve">12. When something looks wrong</w:t>
+        <w:t xml:space="preserve">12. Deliveries — orders that leave the restaurant</w:t>
+      </w:r>
+    </w:p>
+    <w:p>
+      <w:pPr>
+        <w:pStyle w:val="FirstParagraph"/>
+      </w:pPr>
+      <w:r>
+        <w:t xml:space="preserve">Deliveries run through the floor like any other order, in a room of their own,</w:t>
+      </w:r>
+      <w:r>
+        <w:t xml:space="preserve"> </w:t>
+      </w:r>
+      <w:r>
+        <w:t xml:space="preserve">so the kitchen, the till and the reports need nothing new.</w:t>
+      </w:r>
+    </w:p>
+    <w:p>
+      <w:pPr>
+        <w:pStyle w:val="BodyText"/>
+      </w:pPr>
+      <w:r>
+        <w:rPr>
+          <w:b/>
+          <w:bCs/>
+        </w:rPr>
+        <w:t xml:space="preserve">How it is set up (already done):</w:t>
+      </w:r>
+      <w:r>
+        <w:t xml:space="preserve"> </w:t>
+      </w:r>
+      <w:r>
+        <w:t xml:space="preserve">a room called</w:t>
+      </w:r>
+      <w:r>
+        <w:t xml:space="preserve"> </w:t>
+      </w:r>
+      <w:r>
+        <w:rPr>
+          <w:b/>
+          <w:bCs/>
+        </w:rPr>
+        <w:t xml:space="preserve">Delivery</w:t>
+      </w:r>
+      <w:r>
+        <w:t xml:space="preserve"> </w:t>
+      </w:r>
+      <w:r>
+        <w:t xml:space="preserve">with three slots</w:t>
+      </w:r>
+      <w:r>
+        <w:t xml:space="preserve"> </w:t>
+      </w:r>
+      <w:r>
+        <w:t xml:space="preserve">(</w:t>
+      </w:r>
+      <w:r>
+        <w:rPr>
+          <w:i/>
+          <w:iCs/>
+        </w:rPr>
+        <w:t xml:space="preserve">Delivery 1–3</w:t>
+      </w:r>
+      <w:r>
+        <w:t xml:space="preserve">); a</w:t>
+      </w:r>
+      <w:r>
+        <w:t xml:space="preserve"> </w:t>
+      </w:r>
+      <w:r>
+        <w:rPr>
+          <w:b/>
+          <w:bCs/>
+        </w:rPr>
+        <w:t xml:space="preserve">Delivery Charges</w:t>
+      </w:r>
+      <w:r>
+        <w:t xml:space="preserve"> </w:t>
+      </w:r>
+      <w:r>
+        <w:t xml:space="preserve">income account; and one fee record.</w:t>
+      </w:r>
+    </w:p>
+    <w:p>
+      <w:pPr>
+        <w:pStyle w:val="BodyText"/>
+      </w:pPr>
+      <w:r>
+        <w:rPr>
+          <w:b/>
+          <w:bCs/>
+        </w:rPr>
+        <w:t xml:space="preserve">a) Set the delivery fee</w:t>
+      </w:r>
+      <w:r>
+        <w:t xml:space="preserve"> </w:t>
+      </w:r>
+      <w:r>
+        <w:t xml:space="preserve">— search</w:t>
+      </w:r>
+      <w:r>
+        <w:t xml:space="preserve"> </w:t>
+      </w:r>
+      <w:r>
+        <w:rPr>
+          <w:rStyle w:val="VerbatimChar"/>
+        </w:rPr>
+        <w:t xml:space="preserve">RM Delivery Charges</w:t>
+      </w:r>
+      <w:r>
+        <w:t xml:space="preserve"> </w:t>
+      </w:r>
+      <w:r>
+        <w:t xml:space="preserve">→ open the record →</w:t>
+      </w:r>
+      <w:r>
+        <w:t xml:space="preserve"> </w:t>
+      </w:r>
+      <w:r>
+        <w:rPr>
+          <w:b/>
+          <w:bCs/>
+        </w:rPr>
+        <w:t xml:space="preserve">Default Rate</w:t>
+      </w:r>
+      <w:r>
+        <w:t xml:space="preserve"> </w:t>
+      </w:r>
+      <w:r>
+        <w:t xml:space="preserve">→ Save. This is the fee added to every delivery bill. Change it</w:t>
+      </w:r>
+      <w:r>
+        <w:t xml:space="preserve"> </w:t>
+      </w:r>
+      <w:r>
+        <w:t xml:space="preserve">whenever you like (rain, distance, peak hours); the till can also change the</w:t>
+      </w:r>
+      <w:r>
+        <w:t xml:space="preserve"> </w:t>
+      </w:r>
+      <w:r>
+        <w:t xml:space="preserve">fee on a single bill before payment.</w:t>
+      </w:r>
+    </w:p>
+    <w:p>
+      <w:pPr>
+        <w:pStyle w:val="BodyText"/>
+      </w:pPr>
+      <w:r>
+        <w:rPr>
+          <w:b/>
+          <w:bCs/>
+        </w:rPr>
+        <w:t xml:space="preserve">b) Riders are waiters.</w:t>
+      </w:r>
+      <w:r>
+        <w:t xml:space="preserve"> </w:t>
+      </w:r>
+      <w:r>
+        <w:t xml:space="preserve">Add each rider under</w:t>
+      </w:r>
+      <w:r>
+        <w:t xml:space="preserve"> </w:t>
+      </w:r>
+      <w:r>
+        <w:rPr>
+          <w:rStyle w:val="VerbatimChar"/>
+        </w:rPr>
+        <w:t xml:space="preserve">Restaurant Waiter</w:t>
+      </w:r>
+      <w:r>
+        <w:t xml:space="preserve"> </w:t>
+      </w:r>
+      <w:r>
+        <w:t xml:space="preserve">with a PIN,</w:t>
+      </w:r>
+      <w:r>
+        <w:t xml:space="preserve"> </w:t>
+      </w:r>
+      <w:r>
+        <w:t xml:space="preserve">exactly like a waiter (section 6). They sign in on the tablet with</w:t>
+      </w:r>
+      <w:r>
+        <w:t xml:space="preserve"> </w:t>
+      </w:r>
+      <w:r>
+        <w:rPr>
+          <w:b/>
+          <w:bCs/>
+        </w:rPr>
+        <w:t xml:space="preserve">Waiter →</w:t>
+      </w:r>
+      <w:r>
+        <w:rPr>
+          <w:b/>
+          <w:bCs/>
+        </w:rPr>
+        <w:t xml:space="preserve"> </w:t>
+      </w:r>
+      <w:r>
+        <w:rPr>
+          <w:b/>
+          <w:bCs/>
+        </w:rPr>
+        <w:t xml:space="preserve">name → PIN</w:t>
+      </w:r>
+      <w:r>
+        <w:t xml:space="preserve">. Every delivery they seat is credited to them.</w:t>
+      </w:r>
+    </w:p>
+    <w:p>
+      <w:pPr>
+        <w:pStyle w:val="BodyText"/>
+      </w:pPr>
+      <w:r>
+        <w:rPr>
+          <w:b/>
+          <w:bCs/>
+        </w:rPr>
+        <w:t xml:space="preserve">c) Taking a delivery order</w:t>
+      </w:r>
+      <w:r>
+        <w:t xml:space="preserve"> </w:t>
+      </w:r>
+      <w:r>
+        <w:t xml:space="preserve">(rider or whoever answers the phone, signed in):</w:t>
+      </w:r>
+    </w:p>
+    <w:p>
+      <w:pPr>
+        <w:pStyle w:val="Compact"/>
+        <w:numPr>
+          <w:ilvl w:val="0"/>
+          <w:numId w:val="1012"/>
+        </w:numPr>
+      </w:pPr>
+      <w:r>
+        <w:rPr>
+          <w:b/>
+          <w:bCs/>
+        </w:rPr>
+        <w:t xml:space="preserve">Seat guest</w:t>
+      </w:r>
+      <w:r>
+        <w:t xml:space="preserve"> </w:t>
+      </w:r>
+      <w:r>
+        <w:t xml:space="preserve">→ the customer’s name and</w:t>
+      </w:r>
+      <w:r>
+        <w:t xml:space="preserve"> </w:t>
+      </w:r>
+      <w:r>
+        <w:rPr>
+          <w:b/>
+          <w:bCs/>
+        </w:rPr>
+        <w:t xml:space="preserve">phone</w:t>
+      </w:r>
+      <w:r>
+        <w:t xml:space="preserve"> </w:t>
+      </w:r>
+      <w:r>
+        <w:t xml:space="preserve">→ pick a</w:t>
+      </w:r>
+      <w:r>
+        <w:t xml:space="preserve"> </w:t>
+      </w:r>
+      <w:r>
+        <w:rPr>
+          <w:b/>
+          <w:bCs/>
+        </w:rPr>
+        <w:t xml:space="preserve">Delivery</w:t>
+      </w:r>
+      <w:r>
+        <w:rPr>
+          <w:b/>
+          <w:bCs/>
+        </w:rPr>
+        <w:t xml:space="preserve"> </w:t>
+      </w:r>
+      <w:r>
+        <w:rPr>
+          <w:b/>
+          <w:bCs/>
+        </w:rPr>
+        <w:t xml:space="preserve">slot</w:t>
+      </w:r>
+      <w:r>
+        <w:t xml:space="preserve"> </w:t>
+      </w:r>
+      <w:r>
+        <w:t xml:space="preserve">→ the</w:t>
+      </w:r>
+      <w:r>
+        <w:t xml:space="preserve"> </w:t>
+      </w:r>
+      <w:r>
+        <w:rPr>
+          <w:b/>
+          <w:bCs/>
+        </w:rPr>
+        <w:t xml:space="preserve">Delivery address / directions</w:t>
+      </w:r>
+      <w:r>
+        <w:t xml:space="preserve"> </w:t>
+      </w:r>
+      <w:r>
+        <w:t xml:space="preserve">box appears → fill it →</w:t>
+      </w:r>
+      <w:r>
+        <w:t xml:space="preserve"> </w:t>
+      </w:r>
+      <w:r>
+        <w:rPr>
+          <w:i/>
+          <w:iCs/>
+        </w:rPr>
+        <w:t xml:space="preserve">Seat &amp; open order</w:t>
+      </w:r>
+      <w:r>
+        <w:t xml:space="preserve">.</w:t>
+      </w:r>
+    </w:p>
+    <w:p>
+      <w:pPr>
+        <w:pStyle w:val="Compact"/>
+        <w:numPr>
+          <w:ilvl w:val="0"/>
+          <w:numId w:val="1012"/>
+        </w:numPr>
+      </w:pPr>
+      <w:r>
+        <w:t xml:space="preserve">Ring the dishes and</w:t>
+      </w:r>
+      <w:r>
+        <w:t xml:space="preserve"> </w:t>
+      </w:r>
+      <w:r>
+        <w:rPr>
+          <w:b/>
+          <w:bCs/>
+        </w:rPr>
+        <w:t xml:space="preserve">Order</w:t>
+      </w:r>
+      <w:r>
+        <w:t xml:space="preserve"> </w:t>
+      </w:r>
+      <w:r>
+        <w:t xml:space="preserve">them as usual. The kitchen ticket shows the</w:t>
+      </w:r>
+      <w:r>
+        <w:t xml:space="preserve"> </w:t>
+      </w:r>
+      <w:r>
+        <w:t xml:space="preserve">customer’s name, phone and address, and the slot number.</w:t>
+      </w:r>
+    </w:p>
+    <w:p>
+      <w:pPr>
+        <w:pStyle w:val="Compact"/>
+        <w:numPr>
+          <w:ilvl w:val="0"/>
+          <w:numId w:val="1012"/>
+        </w:numPr>
+      </w:pPr>
+      <w:r>
+        <w:t xml:space="preserve">The check stays open on its slot until it is paid.</w:t>
+      </w:r>
+    </w:p>
+    <w:p>
+      <w:pPr>
+        <w:pStyle w:val="FirstParagraph"/>
+      </w:pPr>
+      <w:r>
+        <w:rPr>
+          <w:b/>
+          <w:bCs/>
+        </w:rPr>
+        <w:t xml:space="preserve">d) Payment</w:t>
+      </w:r>
+      <w:r>
+        <w:t xml:space="preserve">, at the till, with</w:t>
+      </w:r>
+      <w:r>
+        <w:t xml:space="preserve"> </w:t>
+      </w:r>
+      <w:r>
+        <w:rPr>
+          <w:b/>
+          <w:bCs/>
+        </w:rPr>
+        <w:t xml:space="preserve">Complete</w:t>
+      </w:r>
+      <w:r>
+        <w:t xml:space="preserve"> </w:t>
+      </w:r>
+      <w:r>
+        <w:t xml:space="preserve">on the slot’s check:</w:t>
       </w:r>
     </w:p>
     <w:tbl>
@@ -4383,6 +4782,253 @@
               <w:jc w:val="left"/>
             </w:pPr>
             <w:r>
+              <w:t xml:space="preserve">How the customer pays</w:t>
+            </w:r>
+          </w:p>
+        </w:tc>
+        <w:tc>
+          <w:tcPr/>
+          <w:p>
+            <w:pPr>
+              <w:pStyle w:val="Compact"/>
+              <w:jc w:val="left"/>
+            </w:pPr>
+            <w:r>
+              <w:t xml:space="preserve">What the till does</w:t>
+            </w:r>
+          </w:p>
+        </w:tc>
+      </w:tr>
+      <w:tr>
+        <w:tc>
+          <w:tcPr/>
+          <w:p>
+            <w:pPr>
+              <w:pStyle w:val="Compact"/>
+              <w:jc w:val="left"/>
+            </w:pPr>
+            <w:r>
+              <w:t xml:space="preserve">M-Pesa or card before the rider leaves</w:t>
+            </w:r>
+          </w:p>
+        </w:tc>
+        <w:tc>
+          <w:tcPr/>
+          <w:p>
+            <w:pPr>
+              <w:pStyle w:val="Compact"/>
+              <w:jc w:val="left"/>
+            </w:pPr>
+            <w:r>
+              <w:t xml:space="preserve">Complete → pay → receipt goes with the rider</w:t>
+            </w:r>
+          </w:p>
+        </w:tc>
+      </w:tr>
+      <w:tr>
+        <w:tc>
+          <w:tcPr/>
+          <w:p>
+            <w:pPr>
+              <w:pStyle w:val="Compact"/>
+              <w:jc w:val="left"/>
+            </w:pPr>
+            <w:r>
+              <w:t xml:space="preserve">Cash on delivery</w:t>
+            </w:r>
+          </w:p>
+        </w:tc>
+        <w:tc>
+          <w:tcPr/>
+          <w:p>
+            <w:pPr>
+              <w:pStyle w:val="Compact"/>
+              <w:jc w:val="left"/>
+            </w:pPr>
+            <w:r>
+              <w:t xml:space="preserve">Leave the check open. When the rider returns with the cash, Complete → Cash.</w:t>
+            </w:r>
+          </w:p>
+        </w:tc>
+      </w:tr>
+    </w:tbl>
+    <w:p>
+      <w:pPr>
+        <w:pStyle w:val="BodyText"/>
+      </w:pPr>
+      <w:r>
+        <w:t xml:space="preserve">The pay screen opens with</w:t>
+      </w:r>
+      <w:r>
+        <w:t xml:space="preserve"> </w:t>
+      </w:r>
+      <w:r>
+        <w:rPr>
+          <w:b/>
+          <w:bCs/>
+        </w:rPr>
+        <w:t xml:space="preserve">Is delivery</w:t>
+      </w:r>
+      <w:r>
+        <w:t xml:space="preserve"> </w:t>
+      </w:r>
+      <w:r>
+        <w:t xml:space="preserve">ticked and the fee filled in; the</w:t>
+      </w:r>
+      <w:r>
+        <w:t xml:space="preserve"> </w:t>
+      </w:r>
+      <w:r>
+        <w:t xml:space="preserve">fee prints on the receipt as its own line (</w:t>
+      </w:r>
+      <w:r>
+        <w:t xml:space="preserve">“</w:t>
+      </w:r>
+      <w:r>
+        <w:t xml:space="preserve">Delivery</w:t>
+      </w:r>
+      <w:r>
+        <w:t xml:space="preserve">”</w:t>
+      </w:r>
+      <w:r>
+        <w:t xml:space="preserve">) and lands in the</w:t>
+      </w:r>
+      <w:r>
+        <w:t xml:space="preserve"> </w:t>
+      </w:r>
+      <w:r>
+        <w:t xml:space="preserve">Delivery Charges account.</w:t>
+      </w:r>
+    </w:p>
+    <w:p>
+      <w:pPr>
+        <w:pStyle w:val="BodyText"/>
+      </w:pPr>
+      <w:r>
+        <w:rPr>
+          <w:b/>
+          <w:bCs/>
+        </w:rPr>
+        <w:t xml:space="preserve">e) Rider commission</w:t>
+      </w:r>
+      <w:r>
+        <w:t xml:space="preserve"> </w:t>
+      </w:r>
+      <w:r>
+        <w:t xml:space="preserve">—</w:t>
+      </w:r>
+      <w:r>
+        <w:t xml:space="preserve"> </w:t>
+      </w:r>
+      <w:r>
+        <w:rPr>
+          <w:rStyle w:val="VerbatimChar"/>
+        </w:rPr>
+        <w:t xml:space="preserve">Sales by Waiter</w:t>
+      </w:r>
+      <w:r>
+        <w:t xml:space="preserve"> </w:t>
+      </w:r>
+      <w:r>
+        <w:t xml:space="preserve">→ set the dates →</w:t>
+      </w:r>
+      <w:r>
+        <w:t xml:space="preserve"> </w:t>
+      </w:r>
+      <w:r>
+        <w:rPr>
+          <w:b/>
+          <w:bCs/>
+        </w:rPr>
+        <w:t xml:space="preserve">Room = Delivery</w:t>
+      </w:r>
+      <w:r>
+        <w:t xml:space="preserve">.</w:t>
+      </w:r>
+      <w:r>
+        <w:t xml:space="preserve"> </w:t>
+      </w:r>
+      <w:r>
+        <w:t xml:space="preserve">Each rider’s row shows their deliveries and sales for the period; apply the</w:t>
+      </w:r>
+      <w:r>
+        <w:t xml:space="preserve"> </w:t>
+      </w:r>
+      <w:r>
+        <w:t xml:space="preserve">agreed percentage to the Sales column.</w:t>
+      </w:r>
+    </w:p>
+    <w:p>
+      <w:pPr>
+        <w:pStyle w:val="BlockText"/>
+      </w:pPr>
+      <w:r>
+        <w:t xml:space="preserve">A delivery slot is just a table: three slots means three deliveries out at</w:t>
+      </w:r>
+      <w:r>
+        <w:t xml:space="preserve"> </w:t>
+      </w:r>
+      <w:r>
+        <w:t xml:space="preserve">once. Add more with the pencil →</w:t>
+      </w:r>
+      <w:r>
+        <w:t xml:space="preserve"> </w:t>
+      </w:r>
+      <w:r>
+        <w:rPr>
+          <w:b/>
+          <w:bCs/>
+        </w:rPr>
+        <w:t xml:space="preserve">+ Table</w:t>
+      </w:r>
+      <w:r>
+        <w:t xml:space="preserve"> </w:t>
+      </w:r>
+      <w:r>
+        <w:t xml:space="preserve">in the Delivery room if you need them.</w:t>
+      </w:r>
+    </w:p>
+    <w:p>
+      <w:r>
+        <w:pict>
+          <v:rect style="width:0;height:1.5pt" o:hralign="center" o:hrstd="t" o:hr="t"/>
+        </w:pict>
+      </w:r>
+    </w:p>
+    <w:bookmarkEnd w:id="32"/>
+    <w:bookmarkStart w:id="33" w:name="when-something-looks-wrong"/>
+    <w:p>
+      <w:pPr>
+        <w:pStyle w:val="Heading1"/>
+      </w:pPr>
+      <w:r>
+        <w:t xml:space="preserve">13. When something looks wrong</w:t>
+      </w:r>
+    </w:p>
+    <w:tbl>
+      <w:tblPr>
+        <w:tblStyle w:val="Table"/>
+        <w:tblW w:type="pct" w:w="5000"/>
+        <w:jc w:val="left"/>
+        <w:tblLayout w:type="fixed"/>
+        <w:tblLook w:firstRow="1" w:lastRow="0" w:firstColumn="0" w:lastColumn="0" w:noHBand="0" w:noVBand="0" w:val="0020"/>
+      </w:tblPr>
+      <w:tblGrid>
+        <w:gridCol w:w="3960"/>
+        <w:gridCol w:w="3960"/>
+      </w:tblGrid>
+      <w:tr>
+        <w:trPr>
+          <w:tblHeader w:val="on"/>
+        </w:trPr>
+        <w:tc>
+          <w:tcPr/>
+          <w:p>
+            <w:pPr>
+              <w:pStyle w:val="Compact"/>
+              <w:jc w:val="left"/>
+            </w:pPr>
+            <w:r>
               <w:t xml:space="preserve">Symptom</w:t>
             </w:r>
           </w:p>
@@ -4733,7 +5379,7 @@
         <w:t xml:space="preserve">looks wrong.</w:t>
       </w:r>
     </w:p>
-    <w:bookmarkEnd w:id="32"/>
+    <w:bookmarkEnd w:id="33"/>
     <w:sectPr/>
   </w:body>
 </w:document>
@@ -5251,6 +5897,36 @@
     </w:lvlOverride>
   </w:num>
   <w:num w:numId="1011">
+    <w:abstractNumId w:val="99411"/>
+    <w:lvlOverride w:ilvl="0">
+      <w:startOverride w:val="1"/>
+    </w:lvlOverride>
+    <w:lvlOverride w:ilvl="1">
+      <w:startOverride w:val="1"/>
+    </w:lvlOverride>
+    <w:lvlOverride w:ilvl="2">
+      <w:startOverride w:val="1"/>
+    </w:lvlOverride>
+    <w:lvlOverride w:ilvl="3">
+      <w:startOverride w:val="1"/>
+    </w:lvlOverride>
+    <w:lvlOverride w:ilvl="4">
+      <w:startOverride w:val="1"/>
+    </w:lvlOverride>
+    <w:lvlOverride w:ilvl="5">
+      <w:startOverride w:val="1"/>
+    </w:lvlOverride>
+    <w:lvlOverride w:ilvl="6">
+      <w:startOverride w:val="1"/>
+    </w:lvlOverride>
+    <w:lvlOverride w:ilvl="7">
+      <w:startOverride w:val="1"/>
+    </w:lvlOverride>
+    <w:lvlOverride w:ilvl="8">
+      <w:startOverride w:val="1"/>
+    </w:lvlOverride>
+  </w:num>
+  <w:num w:numId="1012">
     <w:abstractNumId w:val="99411"/>
     <w:lvlOverride w:ilvl="0">
       <w:startOverride w:val="1"/>

</xml_diff>

<commit_message>
docs: attribution — the PIN before every seat and fire, finding twenty-one
</commit_message>
<xml_diff>
--- a/docs/Etham-Admin-Guide.docx
+++ b/docs/Etham-Admin-Guide.docx
@@ -2194,29 +2194,39 @@
         <w:pStyle w:val="FirstParagraph"/>
       </w:pPr>
       <w:r>
-        <w:t xml:space="preserve">On the floor, waiters tap</w:t>
-      </w:r>
-      <w:r>
-        <w:t xml:space="preserve"> </w:t>
-      </w:r>
-      <w:r>
-        <w:rPr>
-          <w:b/>
-          <w:bCs/>
-        </w:rPr>
-        <w:t xml:space="preserve">Waiter → name → PIN</w:t>
-      </w:r>
-      <w:r>
-        <w:t xml:space="preserve"> </w:t>
-      </w:r>
-      <w:r>
-        <w:t xml:space="preserve">once per shift. Seating a</w:t>
-      </w:r>
-      <w:r>
-        <w:t xml:space="preserve"> </w:t>
-      </w:r>
-      <w:r>
-        <w:t xml:space="preserve">guest demands this — every party is owned by whoever seated it, and</w:t>
+        <w:t xml:space="preserve">On the floor a waiter’s PIN is the signature on every action.</w:t>
+      </w:r>
+      <w:r>
+        <w:t xml:space="preserve"> </w:t>
+      </w:r>
+      <w:r>
+        <w:rPr>
+          <w:b/>
+          <w:bCs/>
+        </w:rPr>
+        <w:t xml:space="preserve">Seat guest</w:t>
+      </w:r>
+      <w:r>
+        <w:t xml:space="preserve"> </w:t>
+      </w:r>
+      <w:r>
+        <w:t xml:space="preserve">and</w:t>
+      </w:r>
+      <w:r>
+        <w:t xml:space="preserve"> </w:t>
+      </w:r>
+      <w:r>
+        <w:rPr>
+          <w:b/>
+          <w:bCs/>
+        </w:rPr>
+        <w:t xml:space="preserve">Order</w:t>
+      </w:r>
+      <w:r>
+        <w:t xml:space="preserve"> </w:t>
+      </w:r>
+      <w:r>
+        <w:t xml:space="preserve">each ask</w:t>
       </w:r>
       <w:r>
         <w:t xml:space="preserve"> </w:t>
@@ -2226,27 +2236,164 @@
           <w:i/>
           <w:iCs/>
         </w:rPr>
-        <w:t xml:space="preserve">Sales by</w:t>
-      </w:r>
-      <w:r>
-        <w:rPr>
-          <w:i/>
-          <w:iCs/>
-        </w:rPr>
-        <w:t xml:space="preserve"> </w:t>
-      </w:r>
-      <w:r>
-        <w:rPr>
-          <w:i/>
-          <w:iCs/>
-        </w:rPr>
-        <w:t xml:space="preserve">Waiter</w:t>
-      </w:r>
-      <w:r>
-        <w:t xml:space="preserve"> </w:t>
-      </w:r>
-      <w:r>
-        <w:t xml:space="preserve">is built from that.</w:t>
+        <w:t xml:space="preserve">Who’s on? → name → PIN</w:t>
+      </w:r>
+      <w:r>
+        <w:t xml:space="preserve"> </w:t>
+      </w:r>
+      <w:r>
+        <w:t xml:space="preserve">— the PIN then stays good for</w:t>
+      </w:r>
+      <w:r>
+        <w:t xml:space="preserve"> </w:t>
+      </w:r>
+      <w:r>
+        <w:rPr>
+          <w:b/>
+          <w:bCs/>
+        </w:rPr>
+        <w:t xml:space="preserve">90 seconds</w:t>
+      </w:r>
+      <w:r>
+        <w:t xml:space="preserve"> </w:t>
+      </w:r>
+      <w:r>
+        <w:t xml:space="preserve">(change it under</w:t>
+      </w:r>
+      <w:r>
+        <w:t xml:space="preserve"> </w:t>
+      </w:r>
+      <w:r>
+        <w:rPr>
+          <w:rStyle w:val="VerbatimChar"/>
+        </w:rPr>
+        <w:t xml:space="preserve">Restaurant Settings → Waiter PIN Recheck</w:t>
+      </w:r>
+      <w:r>
+        <w:t xml:space="preserve">; set it</w:t>
+      </w:r>
+      <w:r>
+        <w:t xml:space="preserve"> </w:t>
+      </w:r>
+      <w:r>
+        <w:t xml:space="preserve">to 1 to ask every single time). Two things are recorded:</w:t>
+      </w:r>
+    </w:p>
+    <w:p>
+      <w:pPr>
+        <w:pStyle w:val="Compact"/>
+        <w:numPr>
+          <w:ilvl w:val="0"/>
+          <w:numId w:val="1007"/>
+        </w:numPr>
+      </w:pPr>
+      <w:r>
+        <w:t xml:space="preserve">the</w:t>
+      </w:r>
+      <w:r>
+        <w:t xml:space="preserve"> </w:t>
+      </w:r>
+      <w:r>
+        <w:rPr>
+          <w:b/>
+          <w:bCs/>
+        </w:rPr>
+        <w:t xml:space="preserve">party and its check belong to the waiter who seated it</w:t>
+      </w:r>
+      <w:r>
+        <w:t xml:space="preserve">;</w:t>
+      </w:r>
+    </w:p>
+    <w:p>
+      <w:pPr>
+        <w:pStyle w:val="Compact"/>
+        <w:numPr>
+          <w:ilvl w:val="0"/>
+          <w:numId w:val="1007"/>
+        </w:numPr>
+      </w:pPr>
+      <w:r>
+        <w:rPr>
+          <w:b/>
+          <w:bCs/>
+        </w:rPr>
+        <w:t xml:space="preserve">every dish fired belongs to the waiter who tapped Order</w:t>
+      </w:r>
+      <w:r>
+        <w:t xml:space="preserve">, and the check’s</w:t>
+      </w:r>
+      <w:r>
+        <w:t xml:space="preserve"> </w:t>
+      </w:r>
+      <w:r>
+        <w:t xml:space="preserve">timeline says who fired what, from which tablet.</w:t>
+      </w:r>
+    </w:p>
+    <w:p>
+      <w:pPr>
+        <w:pStyle w:val="FirstParagraph"/>
+      </w:pPr>
+      <w:r>
+        <w:t xml:space="preserve">So a shared tablet can never credit a sale to whoever happened to sign in</w:t>
+      </w:r>
+      <w:r>
+        <w:t xml:space="preserve"> </w:t>
+      </w:r>
+      <w:r>
+        <w:t xml:space="preserve">last.</w:t>
+      </w:r>
+      <w:r>
+        <w:t xml:space="preserve"> </w:t>
+      </w:r>
+      <w:r>
+        <w:rPr>
+          <w:rStyle w:val="VerbatimChar"/>
+        </w:rPr>
+        <w:t xml:space="preserve">Sales by Waiter</w:t>
+      </w:r>
+      <w:r>
+        <w:t xml:space="preserve"> </w:t>
+      </w:r>
+      <w:r>
+        <w:t xml:space="preserve">shows either view:</w:t>
+      </w:r>
+      <w:r>
+        <w:t xml:space="preserve"> </w:t>
+      </w:r>
+      <w:r>
+        <w:rPr>
+          <w:b/>
+          <w:bCs/>
+        </w:rPr>
+        <w:t xml:space="preserve">Credit = Check owner</w:t>
+      </w:r>
+      <w:r>
+        <w:t xml:space="preserve"> </w:t>
+      </w:r>
+      <w:r>
+        <w:t xml:space="preserve">(the</w:t>
+      </w:r>
+      <w:r>
+        <w:t xml:space="preserve"> </w:t>
+      </w:r>
+      <w:r>
+        <w:t xml:space="preserve">seater) or</w:t>
+      </w:r>
+      <w:r>
+        <w:t xml:space="preserve"> </w:t>
+      </w:r>
+      <w:r>
+        <w:rPr>
+          <w:b/>
+          <w:bCs/>
+        </w:rPr>
+        <w:t xml:space="preserve">Credit = Lines fired</w:t>
+      </w:r>
+      <w:r>
+        <w:t xml:space="preserve"> </w:t>
+      </w:r>
+      <w:r>
+        <w:t xml:space="preserve">(who actually took the dishes).</w:t>
       </w:r>
     </w:p>
     <w:p>
@@ -3449,7 +3596,7 @@
         <w:pStyle w:val="Compact"/>
         <w:numPr>
           <w:ilvl w:val="0"/>
-          <w:numId w:val="1007"/>
+          <w:numId w:val="1008"/>
         </w:numPr>
       </w:pPr>
       <w:r>
@@ -3504,141 +3651,6 @@
       </w:r>
       <w:r>
         <w:t xml:space="preserve">listed with the guest’s name, covers and waiter. Pick one.</w:t>
-      </w:r>
-    </w:p>
-    <w:p>
-      <w:pPr>
-        <w:pStyle w:val="Compact"/>
-        <w:numPr>
-          <w:ilvl w:val="0"/>
-          <w:numId w:val="1007"/>
-        </w:numPr>
-      </w:pPr>
-      <w:r>
-        <w:rPr>
-          <w:b/>
-          <w:bCs/>
-        </w:rPr>
-        <w:t xml:space="preserve">Complete</w:t>
-      </w:r>
-      <w:r>
-        <w:t xml:space="preserve"> </w:t>
-      </w:r>
-      <w:r>
-        <w:t xml:space="preserve">→ take the payment (cash, M-Pesa, or several lines mixed) →</w:t>
-      </w:r>
-      <w:r>
-        <w:t xml:space="preserve"> </w:t>
-      </w:r>
-      <w:r>
-        <w:t xml:space="preserve">the receipt prints.</w:t>
-      </w:r>
-    </w:p>
-    <w:p>
-      <w:pPr>
-        <w:pStyle w:val="Compact"/>
-        <w:numPr>
-          <w:ilvl w:val="0"/>
-          <w:numId w:val="1007"/>
-        </w:numPr>
-      </w:pPr>
-      <w:r>
-        <w:t xml:space="preserve">Paying frees</w:t>
-      </w:r>
-      <w:r>
-        <w:t xml:space="preserve"> </w:t>
-      </w:r>
-      <w:r>
-        <w:rPr>
-          <w:b/>
-          <w:bCs/>
-        </w:rPr>
-        <w:t xml:space="preserve">only that party’s seats</w:t>
-      </w:r>
-      <w:r>
-        <w:t xml:space="preserve"> </w:t>
-      </w:r>
-      <w:r>
-        <w:t xml:space="preserve">— the tile drops from</w:t>
-      </w:r>
-      <w:r>
-        <w:t xml:space="preserve"> </w:t>
-      </w:r>
-      <w:r>
-        <w:rPr>
-          <w:rStyle w:val="VerbatimChar"/>
-        </w:rPr>
-        <w:t xml:space="preserve">7/10</w:t>
-      </w:r>
-      <w:r>
-        <w:t xml:space="preserve"> </w:t>
-      </w:r>
-      <w:r>
-        <w:t xml:space="preserve">to</w:t>
-      </w:r>
-      <w:r>
-        <w:t xml:space="preserve"> </w:t>
-      </w:r>
-      <w:r>
-        <w:rPr>
-          <w:rStyle w:val="VerbatimChar"/>
-        </w:rPr>
-        <w:t xml:space="preserve">5/10</w:t>
-      </w:r>
-      <w:r>
-        <w:t xml:space="preserve"> </w:t>
-      </w:r>
-      <w:r>
-        <w:t xml:space="preserve">and the other parties keep eating undisturbed.</w:t>
-      </w:r>
-    </w:p>
-    <w:p>
-      <w:pPr>
-        <w:pStyle w:val="Compact"/>
-        <w:numPr>
-          <w:ilvl w:val="0"/>
-          <w:numId w:val="1007"/>
-        </w:numPr>
-      </w:pPr>
-      <w:r>
-        <w:t xml:space="preserve">Tap the table again for the next party. The check chips in the pad’s left</w:t>
-      </w:r>
-      <w:r>
-        <w:t xml:space="preserve"> </w:t>
-      </w:r>
-      <w:r>
-        <w:t xml:space="preserve">rail (00001, 00002…) switch between parties at any time.</w:t>
-      </w:r>
-    </w:p>
-    <w:p>
-      <w:pPr>
-        <w:pStyle w:val="FirstParagraph"/>
-      </w:pPr>
-      <w:r>
-        <w:t xml:space="preserve">A table with a single party skips the question — its check is selected the</w:t>
-      </w:r>
-      <w:r>
-        <w:t xml:space="preserve"> </w:t>
-      </w:r>
-      <w:r>
-        <w:t xml:space="preserve">moment the pad opens.</w:t>
-      </w:r>
-    </w:p>
-    <w:p>
-      <w:r>
-        <w:pict>
-          <v:rect style="width:0;height:1.5pt" o:hralign="center" o:hrstd="t" o:hr="t"/>
-        </w:pict>
-      </w:r>
-    </w:p>
-    <w:bookmarkEnd w:id="29"/>
-    <w:bookmarkStart w:id="30" w:name="money-rules-worth-knowing"/>
-    <w:p>
-      <w:pPr>
-        <w:pStyle w:val="Heading1"/>
-      </w:pPr>
-      <w:r>
-        <w:t xml:space="preserve">10. Money rules worth knowing</w:t>
       </w:r>
     </w:p>
     <w:p>
@@ -3654,60 +3666,19 @@
           <w:b/>
           <w:bCs/>
         </w:rPr>
-        <w:t xml:space="preserve">Split bills</w:t>
-      </w:r>
-      <w:r>
-        <w:t xml:space="preserve">: on the check →</w:t>
-      </w:r>
-      <w:r>
-        <w:t xml:space="preserve"> </w:t>
-      </w:r>
-      <w:r>
-        <w:rPr>
-          <w:b/>
-          <w:bCs/>
-        </w:rPr>
-        <w:t xml:space="preserve">Divide</w:t>
-      </w:r>
-      <w:r>
-        <w:t xml:space="preserve"> </w:t>
-      </w:r>
-      <w:r>
-        <w:t xml:space="preserve">→ tick the items moving to the</w:t>
-      </w:r>
-      <w:r>
-        <w:t xml:space="preserve"> </w:t>
-      </w:r>
-      <w:r>
-        <w:t xml:space="preserve">new check → each check pays separately, each gets its own numbered receipt.</w:t>
-      </w:r>
-      <w:r>
-        <w:t xml:space="preserve"> </w:t>
-      </w:r>
-      <w:r>
-        <w:t xml:space="preserve">For an even split of one bill:</w:t>
-      </w:r>
-      <w:r>
-        <w:t xml:space="preserve"> </w:t>
-      </w:r>
-      <w:r>
-        <w:rPr>
-          <w:b/>
-          <w:bCs/>
-        </w:rPr>
         <w:t xml:space="preserve">Complete</w:t>
       </w:r>
       <w:r>
         <w:t xml:space="preserve"> </w:t>
       </w:r>
       <w:r>
-        <w:t xml:space="preserve">→ add several payment rows</w:t>
-      </w:r>
-      <w:r>
-        <w:t xml:space="preserve"> </w:t>
-      </w:r>
-      <w:r>
-        <w:t xml:space="preserve">(Cash + M-Pesa + …) on the one receipt.</w:t>
+        <w:t xml:space="preserve">→ take the payment (cash, M-Pesa, or several lines mixed) →</w:t>
+      </w:r>
+      <w:r>
+        <w:t xml:space="preserve"> </w:t>
+      </w:r>
+      <w:r>
+        <w:t xml:space="preserve">the receipt prints.</w:t>
       </w:r>
     </w:p>
     <w:p>
@@ -3719,23 +3690,53 @@
         </w:numPr>
       </w:pPr>
       <w:r>
-        <w:rPr>
-          <w:b/>
-          <w:bCs/>
-        </w:rPr>
-        <w:t xml:space="preserve">Release</w:t>
-      </w:r>
-      <w:r>
-        <w:t xml:space="preserve"> </w:t>
-      </w:r>
-      <w:r>
-        <w:t xml:space="preserve">(floor toolbar) voids a table’s unpaid checks and frees its</w:t>
-      </w:r>
-      <w:r>
-        <w:t xml:space="preserve"> </w:t>
-      </w:r>
-      <w:r>
-        <w:t xml:space="preserve">seats — cashier/manager only, and it never touches a paid sale.</w:t>
+        <w:t xml:space="preserve">Paying frees</w:t>
+      </w:r>
+      <w:r>
+        <w:t xml:space="preserve"> </w:t>
+      </w:r>
+      <w:r>
+        <w:rPr>
+          <w:b/>
+          <w:bCs/>
+        </w:rPr>
+        <w:t xml:space="preserve">only that party’s seats</w:t>
+      </w:r>
+      <w:r>
+        <w:t xml:space="preserve"> </w:t>
+      </w:r>
+      <w:r>
+        <w:t xml:space="preserve">— the tile drops from</w:t>
+      </w:r>
+      <w:r>
+        <w:t xml:space="preserve"> </w:t>
+      </w:r>
+      <w:r>
+        <w:rPr>
+          <w:rStyle w:val="VerbatimChar"/>
+        </w:rPr>
+        <w:t xml:space="preserve">7/10</w:t>
+      </w:r>
+      <w:r>
+        <w:t xml:space="preserve"> </w:t>
+      </w:r>
+      <w:r>
+        <w:t xml:space="preserve">to</w:t>
+      </w:r>
+      <w:r>
+        <w:t xml:space="preserve"> </w:t>
+      </w:r>
+      <w:r>
+        <w:rPr>
+          <w:rStyle w:val="VerbatimChar"/>
+        </w:rPr>
+        <w:t xml:space="preserve">5/10</w:t>
+      </w:r>
+      <w:r>
+        <w:t xml:space="preserve"> </w:t>
+      </w:r>
+      <w:r>
+        <w:t xml:space="preserve">and the other parties keep eating undisturbed.</w:t>
       </w:r>
     </w:p>
     <w:p>
@@ -3747,13 +3748,27 @@
         </w:numPr>
       </w:pPr>
       <w:r>
-        <w:t xml:space="preserve">Receipts print from the pad after payment and open the print dialog</w:t>
-      </w:r>
-      <w:r>
-        <w:t xml:space="preserve"> </w:t>
-      </w:r>
-      <w:r>
-        <w:t xml:space="preserve">automatically. First time on a new tablet: allow pop-ups for the site.</w:t>
+        <w:t xml:space="preserve">Tap the table again for the next party. The check chips in the pad’s left</w:t>
+      </w:r>
+      <w:r>
+        <w:t xml:space="preserve"> </w:t>
+      </w:r>
+      <w:r>
+        <w:t xml:space="preserve">rail (00001, 00002…) switch between parties at any time.</w:t>
+      </w:r>
+    </w:p>
+    <w:p>
+      <w:pPr>
+        <w:pStyle w:val="FirstParagraph"/>
+      </w:pPr>
+      <w:r>
+        <w:t xml:space="preserve">A table with a single party skips the question — its check is selected the</w:t>
+      </w:r>
+      <w:r>
+        <w:t xml:space="preserve"> </w:t>
+      </w:r>
+      <w:r>
+        <w:t xml:space="preserve">moment the pad opens.</w:t>
       </w:r>
     </w:p>
     <w:p>
@@ -3763,184 +3778,14 @@
         </w:pict>
       </w:r>
     </w:p>
-    <w:bookmarkEnd w:id="30"/>
-    <w:bookmarkStart w:id="31" w:name="suppliers-and-reordering-the-full-loop"/>
+    <w:bookmarkEnd w:id="29"/>
+    <w:bookmarkStart w:id="30" w:name="money-rules-worth-knowing"/>
     <w:p>
       <w:pPr>
         <w:pStyle w:val="Heading1"/>
       </w:pPr>
       <w:r>
-        <w:t xml:space="preserve">11. Suppliers and reordering — the full loop</w:t>
-      </w:r>
-    </w:p>
-    <w:p>
-      <w:pPr>
-        <w:pStyle w:val="FirstParagraph"/>
-      </w:pPr>
-      <w:r>
-        <w:t xml:space="preserve">The system ships</w:t>
-      </w:r>
-      <w:r>
-        <w:t xml:space="preserve"> </w:t>
-      </w:r>
-      <w:r>
-        <w:rPr>
-          <w:b/>
-          <w:bCs/>
-        </w:rPr>
-        <w:t xml:space="preserve">ready to buy</w:t>
-      </w:r>
-      <w:r>
-        <w:t xml:space="preserve">: supplier shelves are pre-built (Produce,</w:t>
-      </w:r>
-      <w:r>
-        <w:t xml:space="preserve"> </w:t>
-      </w:r>
-      <w:r>
-        <w:t xml:space="preserve">Butchery &amp; Meat, Dairy, Dry Goods, Beverages, Gas &amp; Fuel, Packaging, Services)</w:t>
-      </w:r>
-      <w:r>
-        <w:t xml:space="preserve"> </w:t>
-      </w:r>
-      <w:r>
-        <w:t xml:space="preserve">and stock</w:t>
-      </w:r>
-      <w:r>
-        <w:t xml:space="preserve"> </w:t>
-      </w:r>
-      <w:r>
-        <w:rPr>
-          <w:b/>
-          <w:bCs/>
-        </w:rPr>
-        <w:t xml:space="preserve">asks to be re-bought by itself</w:t>
-      </w:r>
-      <w:r>
-        <w:t xml:space="preserve"> </w:t>
-      </w:r>
-      <w:r>
-        <w:t xml:space="preserve">the moment an ingredient dips</w:t>
-      </w:r>
-      <w:r>
-        <w:t xml:space="preserve"> </w:t>
-      </w:r>
-      <w:r>
-        <w:t xml:space="preserve">below its reorder level.</w:t>
-      </w:r>
-    </w:p>
-    <w:p>
-      <w:pPr>
-        <w:pStyle w:val="BodyText"/>
-      </w:pPr>
-      <w:r>
-        <w:rPr>
-          <w:b/>
-          <w:bCs/>
-        </w:rPr>
-        <w:t xml:space="preserve">a) Add each supplier once</w:t>
-      </w:r>
-      <w:r>
-        <w:t xml:space="preserve"> </w:t>
-      </w:r>
-      <w:r>
-        <w:t xml:space="preserve">— search</w:t>
-      </w:r>
-      <w:r>
-        <w:t xml:space="preserve"> </w:t>
-      </w:r>
-      <w:r>
-        <w:rPr>
-          <w:rStyle w:val="VerbatimChar"/>
-        </w:rPr>
-        <w:t xml:space="preserve">Supplier</w:t>
-      </w:r>
-      <w:r>
-        <w:t xml:space="preserve"> </w:t>
-      </w:r>
-      <w:r>
-        <w:t xml:space="preserve">→</w:t>
-      </w:r>
-      <w:r>
-        <w:t xml:space="preserve"> </w:t>
-      </w:r>
-      <w:r>
-        <w:rPr>
-          <w:i/>
-          <w:iCs/>
-        </w:rPr>
-        <w:t xml:space="preserve">Add</w:t>
-      </w:r>
-      <w:r>
-        <w:t xml:space="preserve">:</w:t>
-      </w:r>
-    </w:p>
-    <w:p>
-      <w:pPr>
-        <w:pStyle w:val="BlockText"/>
-      </w:pPr>
-      <w:r>
-        <w:t xml:space="preserve">If a new user cannot see</w:t>
-      </w:r>
-      <w:r>
-        <w:t xml:space="preserve"> </w:t>
-      </w:r>
-      <w:r>
-        <w:rPr>
-          <w:i/>
-          <w:iCs/>
-        </w:rPr>
-        <w:t xml:space="preserve">Add</w:t>
-      </w:r>
-      <w:r>
-        <w:t xml:space="preserve"> </w:t>
-      </w:r>
-      <w:r>
-        <w:t xml:space="preserve">on the Supplier list, they are missing the</w:t>
-      </w:r>
-      <w:r>
-        <w:t xml:space="preserve"> </w:t>
-      </w:r>
-      <w:r>
-        <w:rPr>
-          <w:rStyle w:val="VerbatimChar"/>
-        </w:rPr>
-        <w:t xml:space="preserve">Purchase Master Manager</w:t>
-      </w:r>
-      <w:r>
-        <w:t xml:space="preserve"> </w:t>
-      </w:r>
-      <w:r>
-        <w:t xml:space="preserve">role;</w:t>
-      </w:r>
-      <w:r>
-        <w:t xml:space="preserve"> </w:t>
-      </w:r>
-      <w:r>
-        <w:rPr>
-          <w:rStyle w:val="VerbatimChar"/>
-        </w:rPr>
-        <w:t xml:space="preserve">admin@</w:t>
-      </w:r>
-      <w:r>
-        <w:t xml:space="preserve"> </w:t>
-      </w:r>
-      <w:r>
-        <w:t xml:space="preserve">and</w:t>
-      </w:r>
-      <w:r>
-        <w:t xml:space="preserve"> </w:t>
-      </w:r>
-      <w:r>
-        <w:rPr>
-          <w:rStyle w:val="VerbatimChar"/>
-        </w:rPr>
-        <w:t xml:space="preserve">geff@</w:t>
-      </w:r>
-      <w:r>
-        <w:t xml:space="preserve"> </w:t>
-      </w:r>
-      <w:r>
-        <w:t xml:space="preserve">already have it.</w:t>
+        <w:t xml:space="preserve">10. Money rules worth knowing</w:t>
       </w:r>
     </w:p>
     <w:p>
@@ -3952,23 +3797,64 @@
         </w:numPr>
       </w:pPr>
       <w:r>
-        <w:t xml:space="preserve">Name, then pick the</w:t>
-      </w:r>
-      <w:r>
-        <w:t xml:space="preserve"> </w:t>
-      </w:r>
-      <w:r>
-        <w:rPr>
-          <w:b/>
-          <w:bCs/>
-        </w:rPr>
-        <w:t xml:space="preserve">Supplier Group</w:t>
-      </w:r>
-      <w:r>
-        <w:t xml:space="preserve"> </w:t>
-      </w:r>
-      <w:r>
-        <w:t xml:space="preserve">from the pre-built list.</w:t>
+        <w:rPr>
+          <w:b/>
+          <w:bCs/>
+        </w:rPr>
+        <w:t xml:space="preserve">Split bills</w:t>
+      </w:r>
+      <w:r>
+        <w:t xml:space="preserve">: on the check →</w:t>
+      </w:r>
+      <w:r>
+        <w:t xml:space="preserve"> </w:t>
+      </w:r>
+      <w:r>
+        <w:rPr>
+          <w:b/>
+          <w:bCs/>
+        </w:rPr>
+        <w:t xml:space="preserve">Divide</w:t>
+      </w:r>
+      <w:r>
+        <w:t xml:space="preserve"> </w:t>
+      </w:r>
+      <w:r>
+        <w:t xml:space="preserve">→ tick the items moving to the</w:t>
+      </w:r>
+      <w:r>
+        <w:t xml:space="preserve"> </w:t>
+      </w:r>
+      <w:r>
+        <w:t xml:space="preserve">new check → each check pays separately, each gets its own numbered receipt.</w:t>
+      </w:r>
+      <w:r>
+        <w:t xml:space="preserve"> </w:t>
+      </w:r>
+      <w:r>
+        <w:t xml:space="preserve">For an even split of one bill:</w:t>
+      </w:r>
+      <w:r>
+        <w:t xml:space="preserve"> </w:t>
+      </w:r>
+      <w:r>
+        <w:rPr>
+          <w:b/>
+          <w:bCs/>
+        </w:rPr>
+        <w:t xml:space="preserve">Complete</w:t>
+      </w:r>
+      <w:r>
+        <w:t xml:space="preserve"> </w:t>
+      </w:r>
+      <w:r>
+        <w:t xml:space="preserve">→ add several payment rows</w:t>
+      </w:r>
+      <w:r>
+        <w:t xml:space="preserve"> </w:t>
+      </w:r>
+      <w:r>
+        <w:t xml:space="preserve">(Cash + M-Pesa + …) on the one receipt.</w:t>
       </w:r>
     </w:p>
     <w:p>
@@ -3980,7 +3866,58 @@
         </w:numPr>
       </w:pPr>
       <w:r>
-        <w:t xml:space="preserve">Phone/M-Pesa details under contact — that’s all a purchase needs.</w:t>
+        <w:rPr>
+          <w:b/>
+          <w:bCs/>
+        </w:rPr>
+        <w:t xml:space="preserve">Release</w:t>
+      </w:r>
+      <w:r>
+        <w:t xml:space="preserve"> </w:t>
+      </w:r>
+      <w:r>
+        <w:t xml:space="preserve">(floor toolbar) voids a table’s unpaid checks and frees its</w:t>
+      </w:r>
+      <w:r>
+        <w:t xml:space="preserve"> </w:t>
+      </w:r>
+      <w:r>
+        <w:t xml:space="preserve">seats — cashier/manager only, and it never touches a paid sale.</w:t>
+      </w:r>
+    </w:p>
+    <w:p>
+      <w:pPr>
+        <w:pStyle w:val="Compact"/>
+        <w:numPr>
+          <w:ilvl w:val="0"/>
+          <w:numId w:val="1009"/>
+        </w:numPr>
+      </w:pPr>
+      <w:r>
+        <w:t xml:space="preserve">Receipts print from the pad after payment and open the print dialog</w:t>
+      </w:r>
+      <w:r>
+        <w:t xml:space="preserve"> </w:t>
+      </w:r>
+      <w:r>
+        <w:t xml:space="preserve">automatically. First time on a new tablet: allow pop-ups for the site.</w:t>
+      </w:r>
+    </w:p>
+    <w:p>
+      <w:r>
+        <w:pict>
+          <v:rect style="width:0;height:1.5pt" o:hralign="center" o:hrstd="t" o:hr="t"/>
+        </w:pict>
+      </w:r>
+    </w:p>
+    <w:bookmarkEnd w:id="30"/>
+    <w:bookmarkStart w:id="31" w:name="suppliers-and-reordering-the-full-loop"/>
+    <w:p>
+      <w:pPr>
+        <w:pStyle w:val="Heading1"/>
+      </w:pPr>
+      <w:r>
+        <w:t xml:space="preserve">11. Suppliers and reordering — the full loop</w:t>
       </w:r>
     </w:p>
     <w:p>
@@ -3988,23 +3925,169 @@
         <w:pStyle w:val="FirstParagraph"/>
       </w:pPr>
       <w:r>
-        <w:rPr>
-          <w:b/>
-          <w:bCs/>
-        </w:rPr>
-        <w:t xml:space="preserve">b) Tell each ingredient who supplies it and when to re-buy</w:t>
-      </w:r>
-      <w:r>
-        <w:t xml:space="preserve"> </w:t>
-      </w:r>
-      <w:r>
-        <w:t xml:space="preserve">— open the</w:t>
-      </w:r>
-      <w:r>
-        <w:t xml:space="preserve"> </w:t>
-      </w:r>
-      <w:r>
-        <w:t xml:space="preserve">ingredient’s Item:</w:t>
+        <w:t xml:space="preserve">The system ships</w:t>
+      </w:r>
+      <w:r>
+        <w:t xml:space="preserve"> </w:t>
+      </w:r>
+      <w:r>
+        <w:rPr>
+          <w:b/>
+          <w:bCs/>
+        </w:rPr>
+        <w:t xml:space="preserve">ready to buy</w:t>
+      </w:r>
+      <w:r>
+        <w:t xml:space="preserve">: supplier shelves are pre-built (Produce,</w:t>
+      </w:r>
+      <w:r>
+        <w:t xml:space="preserve"> </w:t>
+      </w:r>
+      <w:r>
+        <w:t xml:space="preserve">Butchery &amp; Meat, Dairy, Dry Goods, Beverages, Gas &amp; Fuel, Packaging, Services)</w:t>
+      </w:r>
+      <w:r>
+        <w:t xml:space="preserve"> </w:t>
+      </w:r>
+      <w:r>
+        <w:t xml:space="preserve">and stock</w:t>
+      </w:r>
+      <w:r>
+        <w:t xml:space="preserve"> </w:t>
+      </w:r>
+      <w:r>
+        <w:rPr>
+          <w:b/>
+          <w:bCs/>
+        </w:rPr>
+        <w:t xml:space="preserve">asks to be re-bought by itself</w:t>
+      </w:r>
+      <w:r>
+        <w:t xml:space="preserve"> </w:t>
+      </w:r>
+      <w:r>
+        <w:t xml:space="preserve">the moment an ingredient dips</w:t>
+      </w:r>
+      <w:r>
+        <w:t xml:space="preserve"> </w:t>
+      </w:r>
+      <w:r>
+        <w:t xml:space="preserve">below its reorder level.</w:t>
+      </w:r>
+    </w:p>
+    <w:p>
+      <w:pPr>
+        <w:pStyle w:val="BodyText"/>
+      </w:pPr>
+      <w:r>
+        <w:rPr>
+          <w:b/>
+          <w:bCs/>
+        </w:rPr>
+        <w:t xml:space="preserve">a) Add each supplier once</w:t>
+      </w:r>
+      <w:r>
+        <w:t xml:space="preserve"> </w:t>
+      </w:r>
+      <w:r>
+        <w:t xml:space="preserve">— search</w:t>
+      </w:r>
+      <w:r>
+        <w:t xml:space="preserve"> </w:t>
+      </w:r>
+      <w:r>
+        <w:rPr>
+          <w:rStyle w:val="VerbatimChar"/>
+        </w:rPr>
+        <w:t xml:space="preserve">Supplier</w:t>
+      </w:r>
+      <w:r>
+        <w:t xml:space="preserve"> </w:t>
+      </w:r>
+      <w:r>
+        <w:t xml:space="preserve">→</w:t>
+      </w:r>
+      <w:r>
+        <w:t xml:space="preserve"> </w:t>
+      </w:r>
+      <w:r>
+        <w:rPr>
+          <w:i/>
+          <w:iCs/>
+        </w:rPr>
+        <w:t xml:space="preserve">Add</w:t>
+      </w:r>
+      <w:r>
+        <w:t xml:space="preserve">:</w:t>
+      </w:r>
+    </w:p>
+    <w:p>
+      <w:pPr>
+        <w:pStyle w:val="BlockText"/>
+      </w:pPr>
+      <w:r>
+        <w:t xml:space="preserve">If a new user cannot see</w:t>
+      </w:r>
+      <w:r>
+        <w:t xml:space="preserve"> </w:t>
+      </w:r>
+      <w:r>
+        <w:rPr>
+          <w:i/>
+          <w:iCs/>
+        </w:rPr>
+        <w:t xml:space="preserve">Add</w:t>
+      </w:r>
+      <w:r>
+        <w:t xml:space="preserve"> </w:t>
+      </w:r>
+      <w:r>
+        <w:t xml:space="preserve">on the Supplier list, they are missing the</w:t>
+      </w:r>
+      <w:r>
+        <w:t xml:space="preserve"> </w:t>
+      </w:r>
+      <w:r>
+        <w:rPr>
+          <w:rStyle w:val="VerbatimChar"/>
+        </w:rPr>
+        <w:t xml:space="preserve">Purchase Master Manager</w:t>
+      </w:r>
+      <w:r>
+        <w:t xml:space="preserve"> </w:t>
+      </w:r>
+      <w:r>
+        <w:t xml:space="preserve">role;</w:t>
+      </w:r>
+      <w:r>
+        <w:t xml:space="preserve"> </w:t>
+      </w:r>
+      <w:r>
+        <w:rPr>
+          <w:rStyle w:val="VerbatimChar"/>
+        </w:rPr>
+        <w:t xml:space="preserve">admin@</w:t>
+      </w:r>
+      <w:r>
+        <w:t xml:space="preserve"> </w:t>
+      </w:r>
+      <w:r>
+        <w:t xml:space="preserve">and</w:t>
+      </w:r>
+      <w:r>
+        <w:t xml:space="preserve"> </w:t>
+      </w:r>
+      <w:r>
+        <w:rPr>
+          <w:rStyle w:val="VerbatimChar"/>
+        </w:rPr>
+        <w:t xml:space="preserve">geff@</w:t>
+      </w:r>
+      <w:r>
+        <w:t xml:space="preserve"> </w:t>
+      </w:r>
+      <w:r>
+        <w:t xml:space="preserve">already have it.</w:t>
       </w:r>
     </w:p>
     <w:p>
@@ -4016,20 +4099,23 @@
         </w:numPr>
       </w:pPr>
       <w:r>
-        <w:t xml:space="preserve">Under</w:t>
-      </w:r>
-      <w:r>
-        <w:t xml:space="preserve"> </w:t>
-      </w:r>
-      <w:r>
-        <w:rPr>
-          <w:b/>
-          <w:bCs/>
-        </w:rPr>
-        <w:t xml:space="preserve">Supplier Items</w:t>
-      </w:r>
-      <w:r>
-        <w:t xml:space="preserve">: add the supplier (their item code optional).</w:t>
+        <w:t xml:space="preserve">Name, then pick the</w:t>
+      </w:r>
+      <w:r>
+        <w:t xml:space="preserve"> </w:t>
+      </w:r>
+      <w:r>
+        <w:rPr>
+          <w:b/>
+          <w:bCs/>
+        </w:rPr>
+        <w:t xml:space="preserve">Supplier Group</w:t>
+      </w:r>
+      <w:r>
+        <w:t xml:space="preserve"> </w:t>
+      </w:r>
+      <w:r>
+        <w:t xml:space="preserve">from the pre-built list.</w:t>
       </w:r>
     </w:p>
     <w:p>
@@ -4041,78 +4127,7 @@
         </w:numPr>
       </w:pPr>
       <w:r>
-        <w:t xml:space="preserve">Under</w:t>
-      </w:r>
-      <w:r>
-        <w:t xml:space="preserve"> </w:t>
-      </w:r>
-      <w:r>
-        <w:rPr>
-          <w:b/>
-          <w:bCs/>
-        </w:rPr>
-        <w:t xml:space="preserve">Reorder</w:t>
-      </w:r>
-      <w:r>
-        <w:t xml:space="preserve">: warehouse</w:t>
-      </w:r>
-      <w:r>
-        <w:t xml:space="preserve"> </w:t>
-      </w:r>
-      <w:r>
-        <w:rPr>
-          <w:i/>
-          <w:iCs/>
-        </w:rPr>
-        <w:t xml:space="preserve">Stores - ETH</w:t>
-      </w:r>
-      <w:r>
-        <w:t xml:space="preserve">,</w:t>
-      </w:r>
-      <w:r>
-        <w:t xml:space="preserve"> </w:t>
-      </w:r>
-      <w:r>
-        <w:rPr>
-          <w:b/>
-          <w:bCs/>
-        </w:rPr>
-        <w:t xml:space="preserve">Reorder Level</w:t>
-      </w:r>
-      <w:r>
-        <w:t xml:space="preserve"> </w:t>
-      </w:r>
-      <w:r>
-        <w:t xml:space="preserve">(e.g. 10 kg),</w:t>
-      </w:r>
-      <w:r>
-        <w:t xml:space="preserve"> </w:t>
-      </w:r>
-      <w:r>
-        <w:rPr>
-          <w:b/>
-          <w:bCs/>
-        </w:rPr>
-        <w:t xml:space="preserve">Reorder Qty</w:t>
-      </w:r>
-      <w:r>
-        <w:t xml:space="preserve"> </w:t>
-      </w:r>
-      <w:r>
-        <w:t xml:space="preserve">(e.g. 50 kg — two bales), type</w:t>
-      </w:r>
-      <w:r>
-        <w:t xml:space="preserve"> </w:t>
-      </w:r>
-      <w:r>
-        <w:rPr>
-          <w:i/>
-          <w:iCs/>
-        </w:rPr>
-        <w:t xml:space="preserve">Purchase</w:t>
-      </w:r>
-      <w:r>
-        <w:t xml:space="preserve">.</w:t>
+        <w:t xml:space="preserve">Phone/M-Pesa details under contact — that’s all a purchase needs.</w:t>
       </w:r>
     </w:p>
     <w:p>
@@ -4124,7 +4139,19 @@
           <w:b/>
           <w:bCs/>
         </w:rPr>
-        <w:t xml:space="preserve">c) From there the loop runs itself:</w:t>
+        <w:t xml:space="preserve">b) Tell each ingredient who supplies it and when to re-buy</w:t>
+      </w:r>
+      <w:r>
+        <w:t xml:space="preserve"> </w:t>
+      </w:r>
+      <w:r>
+        <w:t xml:space="preserve">— open the</w:t>
+      </w:r>
+      <w:r>
+        <w:t xml:space="preserve"> </w:t>
+      </w:r>
+      <w:r>
+        <w:t xml:space="preserve">ingredient’s Item:</w:t>
       </w:r>
     </w:p>
     <w:p>
@@ -4136,7 +4163,20 @@
         </w:numPr>
       </w:pPr>
       <w:r>
-        <w:t xml:space="preserve">Sales consume stock through the recipes (section 5).</w:t>
+        <w:t xml:space="preserve">Under</w:t>
+      </w:r>
+      <w:r>
+        <w:t xml:space="preserve"> </w:t>
+      </w:r>
+      <w:r>
+        <w:rPr>
+          <w:b/>
+          <w:bCs/>
+        </w:rPr>
+        <w:t xml:space="preserve">Supplier Items</w:t>
+      </w:r>
+      <w:r>
+        <w:t xml:space="preserve">: add the supplier (their item code optional).</w:t>
       </w:r>
     </w:p>
     <w:p>
@@ -4148,440 +4188,90 @@
         </w:numPr>
       </w:pPr>
       <w:r>
-        <w:t xml:space="preserve">The moment flour dips below 10 kg, the system raises a</w:t>
-      </w:r>
-      <w:r>
-        <w:t xml:space="preserve"> </w:t>
-      </w:r>
-      <w:r>
-        <w:rPr>
-          <w:b/>
-          <w:bCs/>
-        </w:rPr>
-        <w:t xml:space="preserve">Material Request</w:t>
-      </w:r>
-      <w:r>
-        <w:t xml:space="preserve"> </w:t>
-      </w:r>
-      <w:r>
-        <w:t xml:space="preserve">overnight — no one types anything.</w:t>
-      </w:r>
-    </w:p>
-    <w:p>
-      <w:pPr>
-        <w:pStyle w:val="Compact"/>
-        <w:numPr>
-          <w:ilvl w:val="0"/>
-          <w:numId w:val="1011"/>
-        </w:numPr>
-      </w:pPr>
-      <w:r>
-        <w:t xml:space="preserve">Morning routine: search</w:t>
-      </w:r>
-      <w:r>
-        <w:t xml:space="preserve"> </w:t>
-      </w:r>
-      <w:r>
-        <w:rPr>
-          <w:rStyle w:val="VerbatimChar"/>
-        </w:rPr>
-        <w:t xml:space="preserve">Material Request</w:t>
-      </w:r>
-      <w:r>
-        <w:t xml:space="preserve"> </w:t>
-      </w:r>
-      <w:r>
-        <w:t xml:space="preserve">→ open the day’s requests →</w:t>
-      </w:r>
-      <w:r>
-        <w:t xml:space="preserve"> </w:t>
-      </w:r>
-      <w:r>
-        <w:rPr>
-          <w:b/>
-          <w:bCs/>
-        </w:rPr>
-        <w:t xml:space="preserve">Create → Purchase Order</w:t>
-      </w:r>
-      <w:r>
-        <w:t xml:space="preserve"> </w:t>
-      </w:r>
-      <w:r>
-        <w:t xml:space="preserve">— supplier and quantities are pre-filled from</w:t>
-      </w:r>
-      <w:r>
-        <w:t xml:space="preserve"> </w:t>
-      </w:r>
-      <w:r>
-        <w:t xml:space="preserve">(b). One order per supplier, a few taps.</w:t>
-      </w:r>
-    </w:p>
-    <w:p>
-      <w:pPr>
-        <w:pStyle w:val="Compact"/>
-        <w:numPr>
-          <w:ilvl w:val="0"/>
-          <w:numId w:val="1011"/>
-        </w:numPr>
-      </w:pPr>
-      <w:r>
-        <w:t xml:space="preserve">Goods arrive: open the PO →</w:t>
-      </w:r>
-      <w:r>
-        <w:t xml:space="preserve"> </w:t>
-      </w:r>
-      <w:r>
-        <w:rPr>
-          <w:b/>
-          <w:bCs/>
-        </w:rPr>
-        <w:t xml:space="preserve">Create → Purchase Receipt</w:t>
-      </w:r>
-      <w:r>
-        <w:t xml:space="preserve"> </w:t>
-      </w:r>
-      <w:r>
-        <w:t xml:space="preserve">→ confirm counts →</w:t>
-      </w:r>
-      <w:r>
-        <w:t xml:space="preserve"> </w:t>
-      </w:r>
-      <w:r>
-        <w:t xml:space="preserve">Submit.</w:t>
-      </w:r>
-      <w:r>
-        <w:t xml:space="preserve"> </w:t>
-      </w:r>
-      <w:r>
-        <w:rPr>
-          <w:b/>
-          <w:bCs/>
-        </w:rPr>
-        <w:t xml:space="preserve">Stock goes up, valuation updates</w:t>
-      </w:r>
-      <w:r>
-        <w:t xml:space="preserve"> </w:t>
-      </w:r>
-      <w:r>
-        <w:t xml:space="preserve">— the bale is now 25 counted kg.</w:t>
-      </w:r>
-    </w:p>
-    <w:p>
-      <w:pPr>
-        <w:pStyle w:val="Compact"/>
-        <w:numPr>
-          <w:ilvl w:val="0"/>
-          <w:numId w:val="1011"/>
-        </w:numPr>
-      </w:pPr>
-      <w:r>
-        <w:t xml:space="preserve">The supplier’s bill: PO →</w:t>
-      </w:r>
-      <w:r>
-        <w:t xml:space="preserve"> </w:t>
-      </w:r>
-      <w:r>
-        <w:rPr>
-          <w:b/>
-          <w:bCs/>
-        </w:rPr>
-        <w:t xml:space="preserve">Create → Purchase Invoice</w:t>
-      </w:r>
-      <w:r>
-        <w:t xml:space="preserve"> </w:t>
-      </w:r>
-      <w:r>
-        <w:t xml:space="preserve">→ Submit when paid.</w:t>
-      </w:r>
-      <w:r>
-        <w:t xml:space="preserve"> </w:t>
-      </w:r>
-      <w:r>
-        <w:t xml:space="preserve">Supplier statements live at</w:t>
-      </w:r>
-      <w:r>
-        <w:t xml:space="preserve"> </w:t>
-      </w:r>
-      <w:r>
-        <w:rPr>
-          <w:rStyle w:val="VerbatimChar"/>
-        </w:rPr>
-        <w:t xml:space="preserve">Accounts Payable</w:t>
-      </w:r>
-      <w:r>
-        <w:t xml:space="preserve">.</w:t>
-      </w:r>
-    </w:p>
-    <w:p>
-      <w:pPr>
-        <w:pStyle w:val="FirstParagraph"/>
-      </w:pPr>
-      <w:r>
-        <w:rPr>
-          <w:b/>
-          <w:bCs/>
-        </w:rPr>
-        <w:t xml:space="preserve">Restock List</w:t>
-      </w:r>
-      <w:r>
-        <w:t xml:space="preserve"> </w:t>
-      </w:r>
-      <w:r>
-        <w:t xml:space="preserve">(section 3) stays the manager’s daily glance: everything</w:t>
-      </w:r>
-      <w:r>
-        <w:t xml:space="preserve"> </w:t>
-      </w:r>
-      <w:r>
-        <w:t xml:space="preserve">under its level, how short, and who supplies it — the same list the automatic</w:t>
-      </w:r>
-      <w:r>
-        <w:t xml:space="preserve"> </w:t>
-      </w:r>
-      <w:r>
-        <w:t xml:space="preserve">requests are built from.</w:t>
-      </w:r>
-    </w:p>
-    <w:p>
-      <w:r>
-        <w:pict>
-          <v:rect style="width:0;height:1.5pt" o:hralign="center" o:hrstd="t" o:hr="t"/>
-        </w:pict>
-      </w:r>
-    </w:p>
-    <w:bookmarkEnd w:id="31"/>
-    <w:bookmarkStart w:id="32" w:name="X8fcaa7551dda54495526d9fae00de885002f969"/>
-    <w:p>
-      <w:pPr>
-        <w:pStyle w:val="Heading1"/>
-      </w:pPr>
-      <w:r>
-        <w:t xml:space="preserve">12. Deliveries — orders that leave the restaurant</w:t>
-      </w:r>
-    </w:p>
-    <w:p>
-      <w:pPr>
-        <w:pStyle w:val="FirstParagraph"/>
-      </w:pPr>
-      <w:r>
-        <w:t xml:space="preserve">Deliveries run through the floor like any other order, in a room of their own,</w:t>
-      </w:r>
-      <w:r>
-        <w:t xml:space="preserve"> </w:t>
-      </w:r>
-      <w:r>
-        <w:t xml:space="preserve">so the kitchen, the till and the reports need nothing new.</w:t>
-      </w:r>
-    </w:p>
-    <w:p>
-      <w:pPr>
-        <w:pStyle w:val="BodyText"/>
-      </w:pPr>
-      <w:r>
-        <w:rPr>
-          <w:b/>
-          <w:bCs/>
-        </w:rPr>
-        <w:t xml:space="preserve">How it is set up (already done):</w:t>
-      </w:r>
-      <w:r>
-        <w:t xml:space="preserve"> </w:t>
-      </w:r>
-      <w:r>
-        <w:t xml:space="preserve">a room called</w:t>
-      </w:r>
-      <w:r>
-        <w:t xml:space="preserve"> </w:t>
-      </w:r>
-      <w:r>
-        <w:rPr>
-          <w:b/>
-          <w:bCs/>
-        </w:rPr>
-        <w:t xml:space="preserve">Delivery</w:t>
-      </w:r>
-      <w:r>
-        <w:t xml:space="preserve"> </w:t>
-      </w:r>
-      <w:r>
-        <w:t xml:space="preserve">with three slots</w:t>
-      </w:r>
-      <w:r>
-        <w:t xml:space="preserve"> </w:t>
-      </w:r>
-      <w:r>
-        <w:t xml:space="preserve">(</w:t>
+        <w:t xml:space="preserve">Under</w:t>
+      </w:r>
+      <w:r>
+        <w:t xml:space="preserve"> </w:t>
+      </w:r>
+      <w:r>
+        <w:rPr>
+          <w:b/>
+          <w:bCs/>
+        </w:rPr>
+        <w:t xml:space="preserve">Reorder</w:t>
+      </w:r>
+      <w:r>
+        <w:t xml:space="preserve">: warehouse</w:t>
+      </w:r>
+      <w:r>
+        <w:t xml:space="preserve"> </w:t>
       </w:r>
       <w:r>
         <w:rPr>
           <w:i/>
           <w:iCs/>
         </w:rPr>
-        <w:t xml:space="preserve">Delivery 1–3</w:t>
-      </w:r>
-      <w:r>
-        <w:t xml:space="preserve">); a</w:t>
-      </w:r>
-      <w:r>
-        <w:t xml:space="preserve"> </w:t>
-      </w:r>
-      <w:r>
-        <w:rPr>
-          <w:b/>
-          <w:bCs/>
-        </w:rPr>
-        <w:t xml:space="preserve">Delivery Charges</w:t>
-      </w:r>
-      <w:r>
-        <w:t xml:space="preserve"> </w:t>
-      </w:r>
-      <w:r>
-        <w:t xml:space="preserve">income account; and one fee record.</w:t>
-      </w:r>
-    </w:p>
-    <w:p>
-      <w:pPr>
-        <w:pStyle w:val="BodyText"/>
-      </w:pPr>
-      <w:r>
-        <w:rPr>
-          <w:b/>
-          <w:bCs/>
-        </w:rPr>
-        <w:t xml:space="preserve">a) Set the delivery fee</w:t>
-      </w:r>
-      <w:r>
-        <w:t xml:space="preserve"> </w:t>
-      </w:r>
-      <w:r>
-        <w:t xml:space="preserve">— search</w:t>
-      </w:r>
-      <w:r>
-        <w:t xml:space="preserve"> </w:t>
-      </w:r>
-      <w:r>
-        <w:rPr>
-          <w:rStyle w:val="VerbatimChar"/>
-        </w:rPr>
-        <w:t xml:space="preserve">RM Delivery Charges</w:t>
-      </w:r>
-      <w:r>
-        <w:t xml:space="preserve"> </w:t>
-      </w:r>
-      <w:r>
-        <w:t xml:space="preserve">→ open the record →</w:t>
-      </w:r>
-      <w:r>
-        <w:t xml:space="preserve"> </w:t>
-      </w:r>
-      <w:r>
-        <w:rPr>
-          <w:b/>
-          <w:bCs/>
-        </w:rPr>
-        <w:t xml:space="preserve">Default Rate</w:t>
-      </w:r>
-      <w:r>
-        <w:t xml:space="preserve"> </w:t>
-      </w:r>
-      <w:r>
-        <w:t xml:space="preserve">→ Save. This is the fee added to every delivery bill. Change it</w:t>
-      </w:r>
-      <w:r>
-        <w:t xml:space="preserve"> </w:t>
-      </w:r>
-      <w:r>
-        <w:t xml:space="preserve">whenever you like (rain, distance, peak hours); the till can also change the</w:t>
-      </w:r>
-      <w:r>
-        <w:t xml:space="preserve"> </w:t>
-      </w:r>
-      <w:r>
-        <w:t xml:space="preserve">fee on a single bill before payment.</w:t>
-      </w:r>
-    </w:p>
-    <w:p>
-      <w:pPr>
-        <w:pStyle w:val="BodyText"/>
-      </w:pPr>
-      <w:r>
-        <w:rPr>
-          <w:b/>
-          <w:bCs/>
-        </w:rPr>
-        <w:t xml:space="preserve">b) Riders are waiters.</w:t>
-      </w:r>
-      <w:r>
-        <w:t xml:space="preserve"> </w:t>
-      </w:r>
-      <w:r>
-        <w:t xml:space="preserve">Add each rider under</w:t>
-      </w:r>
-      <w:r>
-        <w:t xml:space="preserve"> </w:t>
-      </w:r>
-      <w:r>
-        <w:rPr>
-          <w:rStyle w:val="VerbatimChar"/>
-        </w:rPr>
-        <w:t xml:space="preserve">Restaurant Waiter</w:t>
-      </w:r>
-      <w:r>
-        <w:t xml:space="preserve"> </w:t>
-      </w:r>
-      <w:r>
-        <w:t xml:space="preserve">with a PIN,</w:t>
-      </w:r>
-      <w:r>
-        <w:t xml:space="preserve"> </w:t>
-      </w:r>
-      <w:r>
-        <w:t xml:space="preserve">exactly like a waiter (section 6). They sign in on the tablet with</w:t>
-      </w:r>
-      <w:r>
-        <w:t xml:space="preserve"> </w:t>
-      </w:r>
-      <w:r>
-        <w:rPr>
-          <w:b/>
-          <w:bCs/>
-        </w:rPr>
-        <w:t xml:space="preserve">Waiter →</w:t>
-      </w:r>
-      <w:r>
-        <w:rPr>
-          <w:b/>
-          <w:bCs/>
-        </w:rPr>
-        <w:t xml:space="preserve"> </w:t>
-      </w:r>
-      <w:r>
-        <w:rPr>
-          <w:b/>
-          <w:bCs/>
-        </w:rPr>
-        <w:t xml:space="preserve">name → PIN</w:t>
-      </w:r>
-      <w:r>
-        <w:t xml:space="preserve">. Every delivery they seat is credited to them.</w:t>
-      </w:r>
-    </w:p>
-    <w:p>
-      <w:pPr>
-        <w:pStyle w:val="BodyText"/>
-      </w:pPr>
-      <w:r>
-        <w:rPr>
-          <w:b/>
-          <w:bCs/>
-        </w:rPr>
-        <w:t xml:space="preserve">c) Taking a delivery order</w:t>
-      </w:r>
-      <w:r>
-        <w:t xml:space="preserve"> </w:t>
-      </w:r>
-      <w:r>
-        <w:t xml:space="preserve">(rider or whoever answers the phone, signed in):</w:t>
+        <w:t xml:space="preserve">Stores - ETH</w:t>
+      </w:r>
+      <w:r>
+        <w:t xml:space="preserve">,</w:t>
+      </w:r>
+      <w:r>
+        <w:t xml:space="preserve"> </w:t>
+      </w:r>
+      <w:r>
+        <w:rPr>
+          <w:b/>
+          <w:bCs/>
+        </w:rPr>
+        <w:t xml:space="preserve">Reorder Level</w:t>
+      </w:r>
+      <w:r>
+        <w:t xml:space="preserve"> </w:t>
+      </w:r>
+      <w:r>
+        <w:t xml:space="preserve">(e.g. 10 kg),</w:t>
+      </w:r>
+      <w:r>
+        <w:t xml:space="preserve"> </w:t>
+      </w:r>
+      <w:r>
+        <w:rPr>
+          <w:b/>
+          <w:bCs/>
+        </w:rPr>
+        <w:t xml:space="preserve">Reorder Qty</w:t>
+      </w:r>
+      <w:r>
+        <w:t xml:space="preserve"> </w:t>
+      </w:r>
+      <w:r>
+        <w:t xml:space="preserve">(e.g. 50 kg — two bales), type</w:t>
+      </w:r>
+      <w:r>
+        <w:t xml:space="preserve"> </w:t>
+      </w:r>
+      <w:r>
+        <w:rPr>
+          <w:i/>
+          <w:iCs/>
+        </w:rPr>
+        <w:t xml:space="preserve">Purchase</w:t>
+      </w:r>
+      <w:r>
+        <w:t xml:space="preserve">.</w:t>
+      </w:r>
+    </w:p>
+    <w:p>
+      <w:pPr>
+        <w:pStyle w:val="FirstParagraph"/>
+      </w:pPr>
+      <w:r>
+        <w:rPr>
+          <w:b/>
+          <w:bCs/>
+        </w:rPr>
+        <w:t xml:space="preserve">c) From there the loop runs itself:</w:t>
       </w:r>
     </w:p>
     <w:p>
@@ -4593,92 +4283,7 @@
         </w:numPr>
       </w:pPr>
       <w:r>
-        <w:rPr>
-          <w:b/>
-          <w:bCs/>
-        </w:rPr>
-        <w:t xml:space="preserve">Seat guest</w:t>
-      </w:r>
-      <w:r>
-        <w:t xml:space="preserve"> </w:t>
-      </w:r>
-      <w:r>
-        <w:t xml:space="preserve">→ the customer’s name and</w:t>
-      </w:r>
-      <w:r>
-        <w:t xml:space="preserve"> </w:t>
-      </w:r>
-      <w:r>
-        <w:rPr>
-          <w:b/>
-          <w:bCs/>
-        </w:rPr>
-        <w:t xml:space="preserve">phone</w:t>
-      </w:r>
-      <w:r>
-        <w:t xml:space="preserve"> </w:t>
-      </w:r>
-      <w:r>
-        <w:t xml:space="preserve">→ pick a</w:t>
-      </w:r>
-      <w:r>
-        <w:t xml:space="preserve"> </w:t>
-      </w:r>
-      <w:r>
-        <w:rPr>
-          <w:b/>
-          <w:bCs/>
-        </w:rPr>
-        <w:t xml:space="preserve">Delivery</w:t>
-      </w:r>
-      <w:r>
-        <w:rPr>
-          <w:b/>
-          <w:bCs/>
-        </w:rPr>
-        <w:t xml:space="preserve"> </w:t>
-      </w:r>
-      <w:r>
-        <w:rPr>
-          <w:b/>
-          <w:bCs/>
-        </w:rPr>
-        <w:t xml:space="preserve">slot</w:t>
-      </w:r>
-      <w:r>
-        <w:t xml:space="preserve"> </w:t>
-      </w:r>
-      <w:r>
-        <w:t xml:space="preserve">→ the</w:t>
-      </w:r>
-      <w:r>
-        <w:t xml:space="preserve"> </w:t>
-      </w:r>
-      <w:r>
-        <w:rPr>
-          <w:b/>
-          <w:bCs/>
-        </w:rPr>
-        <w:t xml:space="preserve">Delivery address / directions</w:t>
-      </w:r>
-      <w:r>
-        <w:t xml:space="preserve"> </w:t>
-      </w:r>
-      <w:r>
-        <w:t xml:space="preserve">box appears → fill it →</w:t>
-      </w:r>
-      <w:r>
-        <w:t xml:space="preserve"> </w:t>
-      </w:r>
-      <w:r>
-        <w:rPr>
-          <w:i/>
-          <w:iCs/>
-        </w:rPr>
-        <w:t xml:space="preserve">Seat &amp; open order</w:t>
-      </w:r>
-      <w:r>
-        <w:t xml:space="preserve">.</w:t>
+        <w:t xml:space="preserve">Sales consume stock through the recipes (section 5).</w:t>
       </w:r>
     </w:p>
     <w:p>
@@ -4690,29 +4295,23 @@
         </w:numPr>
       </w:pPr>
       <w:r>
-        <w:t xml:space="preserve">Ring the dishes and</w:t>
-      </w:r>
-      <w:r>
-        <w:t xml:space="preserve"> </w:t>
-      </w:r>
-      <w:r>
-        <w:rPr>
-          <w:b/>
-          <w:bCs/>
-        </w:rPr>
-        <w:t xml:space="preserve">Order</w:t>
-      </w:r>
-      <w:r>
-        <w:t xml:space="preserve"> </w:t>
-      </w:r>
-      <w:r>
-        <w:t xml:space="preserve">them as usual. The kitchen ticket shows the</w:t>
-      </w:r>
-      <w:r>
-        <w:t xml:space="preserve"> </w:t>
-      </w:r>
-      <w:r>
-        <w:t xml:space="preserve">customer’s name, phone and address, and the slot number.</w:t>
+        <w:t xml:space="preserve">The moment flour dips below 10 kg, the system raises a</w:t>
+      </w:r>
+      <w:r>
+        <w:t xml:space="preserve"> </w:t>
+      </w:r>
+      <w:r>
+        <w:rPr>
+          <w:b/>
+          <w:bCs/>
+        </w:rPr>
+        <w:t xml:space="preserve">Material Request</w:t>
+      </w:r>
+      <w:r>
+        <w:t xml:space="preserve"> </w:t>
+      </w:r>
+      <w:r>
+        <w:t xml:space="preserve">overnight — no one types anything.</w:t>
       </w:r>
     </w:p>
     <w:p>
@@ -4721,6 +4320,554 @@
         <w:numPr>
           <w:ilvl w:val="0"/>
           <w:numId w:val="1012"/>
+        </w:numPr>
+      </w:pPr>
+      <w:r>
+        <w:t xml:space="preserve">Morning routine: search</w:t>
+      </w:r>
+      <w:r>
+        <w:t xml:space="preserve"> </w:t>
+      </w:r>
+      <w:r>
+        <w:rPr>
+          <w:rStyle w:val="VerbatimChar"/>
+        </w:rPr>
+        <w:t xml:space="preserve">Material Request</w:t>
+      </w:r>
+      <w:r>
+        <w:t xml:space="preserve"> </w:t>
+      </w:r>
+      <w:r>
+        <w:t xml:space="preserve">→ open the day’s requests →</w:t>
+      </w:r>
+      <w:r>
+        <w:t xml:space="preserve"> </w:t>
+      </w:r>
+      <w:r>
+        <w:rPr>
+          <w:b/>
+          <w:bCs/>
+        </w:rPr>
+        <w:t xml:space="preserve">Create → Purchase Order</w:t>
+      </w:r>
+      <w:r>
+        <w:t xml:space="preserve"> </w:t>
+      </w:r>
+      <w:r>
+        <w:t xml:space="preserve">— supplier and quantities are pre-filled from</w:t>
+      </w:r>
+      <w:r>
+        <w:t xml:space="preserve"> </w:t>
+      </w:r>
+      <w:r>
+        <w:t xml:space="preserve">(b). One order per supplier, a few taps.</w:t>
+      </w:r>
+    </w:p>
+    <w:p>
+      <w:pPr>
+        <w:pStyle w:val="Compact"/>
+        <w:numPr>
+          <w:ilvl w:val="0"/>
+          <w:numId w:val="1012"/>
+        </w:numPr>
+      </w:pPr>
+      <w:r>
+        <w:t xml:space="preserve">Goods arrive: open the PO →</w:t>
+      </w:r>
+      <w:r>
+        <w:t xml:space="preserve"> </w:t>
+      </w:r>
+      <w:r>
+        <w:rPr>
+          <w:b/>
+          <w:bCs/>
+        </w:rPr>
+        <w:t xml:space="preserve">Create → Purchase Receipt</w:t>
+      </w:r>
+      <w:r>
+        <w:t xml:space="preserve"> </w:t>
+      </w:r>
+      <w:r>
+        <w:t xml:space="preserve">→ confirm counts →</w:t>
+      </w:r>
+      <w:r>
+        <w:t xml:space="preserve"> </w:t>
+      </w:r>
+      <w:r>
+        <w:t xml:space="preserve">Submit.</w:t>
+      </w:r>
+      <w:r>
+        <w:t xml:space="preserve"> </w:t>
+      </w:r>
+      <w:r>
+        <w:rPr>
+          <w:b/>
+          <w:bCs/>
+        </w:rPr>
+        <w:t xml:space="preserve">Stock goes up, valuation updates</w:t>
+      </w:r>
+      <w:r>
+        <w:t xml:space="preserve"> </w:t>
+      </w:r>
+      <w:r>
+        <w:t xml:space="preserve">— the bale is now 25 counted kg.</w:t>
+      </w:r>
+    </w:p>
+    <w:p>
+      <w:pPr>
+        <w:pStyle w:val="Compact"/>
+        <w:numPr>
+          <w:ilvl w:val="0"/>
+          <w:numId w:val="1012"/>
+        </w:numPr>
+      </w:pPr>
+      <w:r>
+        <w:t xml:space="preserve">The supplier’s bill: PO →</w:t>
+      </w:r>
+      <w:r>
+        <w:t xml:space="preserve"> </w:t>
+      </w:r>
+      <w:r>
+        <w:rPr>
+          <w:b/>
+          <w:bCs/>
+        </w:rPr>
+        <w:t xml:space="preserve">Create → Purchase Invoice</w:t>
+      </w:r>
+      <w:r>
+        <w:t xml:space="preserve"> </w:t>
+      </w:r>
+      <w:r>
+        <w:t xml:space="preserve">→ Submit when paid.</w:t>
+      </w:r>
+      <w:r>
+        <w:t xml:space="preserve"> </w:t>
+      </w:r>
+      <w:r>
+        <w:t xml:space="preserve">Supplier statements live at</w:t>
+      </w:r>
+      <w:r>
+        <w:t xml:space="preserve"> </w:t>
+      </w:r>
+      <w:r>
+        <w:rPr>
+          <w:rStyle w:val="VerbatimChar"/>
+        </w:rPr>
+        <w:t xml:space="preserve">Accounts Payable</w:t>
+      </w:r>
+      <w:r>
+        <w:t xml:space="preserve">.</w:t>
+      </w:r>
+    </w:p>
+    <w:p>
+      <w:pPr>
+        <w:pStyle w:val="FirstParagraph"/>
+      </w:pPr>
+      <w:r>
+        <w:rPr>
+          <w:b/>
+          <w:bCs/>
+        </w:rPr>
+        <w:t xml:space="preserve">Restock List</w:t>
+      </w:r>
+      <w:r>
+        <w:t xml:space="preserve"> </w:t>
+      </w:r>
+      <w:r>
+        <w:t xml:space="preserve">(section 3) stays the manager’s daily glance: everything</w:t>
+      </w:r>
+      <w:r>
+        <w:t xml:space="preserve"> </w:t>
+      </w:r>
+      <w:r>
+        <w:t xml:space="preserve">under its level, how short, and who supplies it — the same list the automatic</w:t>
+      </w:r>
+      <w:r>
+        <w:t xml:space="preserve"> </w:t>
+      </w:r>
+      <w:r>
+        <w:t xml:space="preserve">requests are built from.</w:t>
+      </w:r>
+    </w:p>
+    <w:p>
+      <w:r>
+        <w:pict>
+          <v:rect style="width:0;height:1.5pt" o:hralign="center" o:hrstd="t" o:hr="t"/>
+        </w:pict>
+      </w:r>
+    </w:p>
+    <w:bookmarkEnd w:id="31"/>
+    <w:bookmarkStart w:id="32" w:name="X8fcaa7551dda54495526d9fae00de885002f969"/>
+    <w:p>
+      <w:pPr>
+        <w:pStyle w:val="Heading1"/>
+      </w:pPr>
+      <w:r>
+        <w:t xml:space="preserve">12. Deliveries — orders that leave the restaurant</w:t>
+      </w:r>
+    </w:p>
+    <w:p>
+      <w:pPr>
+        <w:pStyle w:val="FirstParagraph"/>
+      </w:pPr>
+      <w:r>
+        <w:t xml:space="preserve">Deliveries run through the floor like any other order, in a room of their own,</w:t>
+      </w:r>
+      <w:r>
+        <w:t xml:space="preserve"> </w:t>
+      </w:r>
+      <w:r>
+        <w:t xml:space="preserve">so the kitchen, the till and the reports need nothing new.</w:t>
+      </w:r>
+    </w:p>
+    <w:p>
+      <w:pPr>
+        <w:pStyle w:val="BodyText"/>
+      </w:pPr>
+      <w:r>
+        <w:rPr>
+          <w:b/>
+          <w:bCs/>
+        </w:rPr>
+        <w:t xml:space="preserve">How it is set up (already done):</w:t>
+      </w:r>
+      <w:r>
+        <w:t xml:space="preserve"> </w:t>
+      </w:r>
+      <w:r>
+        <w:t xml:space="preserve">a room called</w:t>
+      </w:r>
+      <w:r>
+        <w:t xml:space="preserve"> </w:t>
+      </w:r>
+      <w:r>
+        <w:rPr>
+          <w:b/>
+          <w:bCs/>
+        </w:rPr>
+        <w:t xml:space="preserve">Delivery</w:t>
+      </w:r>
+      <w:r>
+        <w:t xml:space="preserve"> </w:t>
+      </w:r>
+      <w:r>
+        <w:t xml:space="preserve">with three slots</w:t>
+      </w:r>
+      <w:r>
+        <w:t xml:space="preserve"> </w:t>
+      </w:r>
+      <w:r>
+        <w:t xml:space="preserve">(</w:t>
+      </w:r>
+      <w:r>
+        <w:rPr>
+          <w:i/>
+          <w:iCs/>
+        </w:rPr>
+        <w:t xml:space="preserve">Delivery 1–3</w:t>
+      </w:r>
+      <w:r>
+        <w:t xml:space="preserve">); a</w:t>
+      </w:r>
+      <w:r>
+        <w:t xml:space="preserve"> </w:t>
+      </w:r>
+      <w:r>
+        <w:rPr>
+          <w:b/>
+          <w:bCs/>
+        </w:rPr>
+        <w:t xml:space="preserve">Delivery Charges</w:t>
+      </w:r>
+      <w:r>
+        <w:t xml:space="preserve"> </w:t>
+      </w:r>
+      <w:r>
+        <w:t xml:space="preserve">income account; and one fee record.</w:t>
+      </w:r>
+    </w:p>
+    <w:p>
+      <w:pPr>
+        <w:pStyle w:val="BodyText"/>
+      </w:pPr>
+      <w:r>
+        <w:rPr>
+          <w:b/>
+          <w:bCs/>
+        </w:rPr>
+        <w:t xml:space="preserve">a) Set the delivery fee</w:t>
+      </w:r>
+      <w:r>
+        <w:t xml:space="preserve"> </w:t>
+      </w:r>
+      <w:r>
+        <w:t xml:space="preserve">— search</w:t>
+      </w:r>
+      <w:r>
+        <w:t xml:space="preserve"> </w:t>
+      </w:r>
+      <w:r>
+        <w:rPr>
+          <w:rStyle w:val="VerbatimChar"/>
+        </w:rPr>
+        <w:t xml:space="preserve">RM Delivery Charges</w:t>
+      </w:r>
+      <w:r>
+        <w:t xml:space="preserve"> </w:t>
+      </w:r>
+      <w:r>
+        <w:t xml:space="preserve">→ open the record →</w:t>
+      </w:r>
+      <w:r>
+        <w:t xml:space="preserve"> </w:t>
+      </w:r>
+      <w:r>
+        <w:rPr>
+          <w:b/>
+          <w:bCs/>
+        </w:rPr>
+        <w:t xml:space="preserve">Default Rate</w:t>
+      </w:r>
+      <w:r>
+        <w:t xml:space="preserve"> </w:t>
+      </w:r>
+      <w:r>
+        <w:t xml:space="preserve">→ Save. This is the fee added to every delivery bill. Change it</w:t>
+      </w:r>
+      <w:r>
+        <w:t xml:space="preserve"> </w:t>
+      </w:r>
+      <w:r>
+        <w:t xml:space="preserve">whenever you like (rain, distance, peak hours); the till can also change the</w:t>
+      </w:r>
+      <w:r>
+        <w:t xml:space="preserve"> </w:t>
+      </w:r>
+      <w:r>
+        <w:t xml:space="preserve">fee on a single bill before payment.</w:t>
+      </w:r>
+    </w:p>
+    <w:p>
+      <w:pPr>
+        <w:pStyle w:val="BodyText"/>
+      </w:pPr>
+      <w:r>
+        <w:rPr>
+          <w:b/>
+          <w:bCs/>
+        </w:rPr>
+        <w:t xml:space="preserve">b) Riders are waiters.</w:t>
+      </w:r>
+      <w:r>
+        <w:t xml:space="preserve"> </w:t>
+      </w:r>
+      <w:r>
+        <w:t xml:space="preserve">Add each rider under</w:t>
+      </w:r>
+      <w:r>
+        <w:t xml:space="preserve"> </w:t>
+      </w:r>
+      <w:r>
+        <w:rPr>
+          <w:rStyle w:val="VerbatimChar"/>
+        </w:rPr>
+        <w:t xml:space="preserve">Restaurant Waiter</w:t>
+      </w:r>
+      <w:r>
+        <w:t xml:space="preserve"> </w:t>
+      </w:r>
+      <w:r>
+        <w:t xml:space="preserve">with a PIN,</w:t>
+      </w:r>
+      <w:r>
+        <w:t xml:space="preserve"> </w:t>
+      </w:r>
+      <w:r>
+        <w:t xml:space="preserve">exactly like a waiter (section 6). They sign in on the tablet with</w:t>
+      </w:r>
+      <w:r>
+        <w:t xml:space="preserve"> </w:t>
+      </w:r>
+      <w:r>
+        <w:rPr>
+          <w:b/>
+          <w:bCs/>
+        </w:rPr>
+        <w:t xml:space="preserve">Waiter →</w:t>
+      </w:r>
+      <w:r>
+        <w:rPr>
+          <w:b/>
+          <w:bCs/>
+        </w:rPr>
+        <w:t xml:space="preserve"> </w:t>
+      </w:r>
+      <w:r>
+        <w:rPr>
+          <w:b/>
+          <w:bCs/>
+        </w:rPr>
+        <w:t xml:space="preserve">name → PIN</w:t>
+      </w:r>
+      <w:r>
+        <w:t xml:space="preserve">. Every delivery they seat is credited to them.</w:t>
+      </w:r>
+    </w:p>
+    <w:p>
+      <w:pPr>
+        <w:pStyle w:val="BodyText"/>
+      </w:pPr>
+      <w:r>
+        <w:rPr>
+          <w:b/>
+          <w:bCs/>
+        </w:rPr>
+        <w:t xml:space="preserve">c) Taking a delivery order</w:t>
+      </w:r>
+      <w:r>
+        <w:t xml:space="preserve"> </w:t>
+      </w:r>
+      <w:r>
+        <w:t xml:space="preserve">(rider or whoever answers the phone, signed in):</w:t>
+      </w:r>
+    </w:p>
+    <w:p>
+      <w:pPr>
+        <w:pStyle w:val="Compact"/>
+        <w:numPr>
+          <w:ilvl w:val="0"/>
+          <w:numId w:val="1013"/>
+        </w:numPr>
+      </w:pPr>
+      <w:r>
+        <w:rPr>
+          <w:b/>
+          <w:bCs/>
+        </w:rPr>
+        <w:t xml:space="preserve">Seat guest</w:t>
+      </w:r>
+      <w:r>
+        <w:t xml:space="preserve"> </w:t>
+      </w:r>
+      <w:r>
+        <w:t xml:space="preserve">→ the customer’s name and</w:t>
+      </w:r>
+      <w:r>
+        <w:t xml:space="preserve"> </w:t>
+      </w:r>
+      <w:r>
+        <w:rPr>
+          <w:b/>
+          <w:bCs/>
+        </w:rPr>
+        <w:t xml:space="preserve">phone</w:t>
+      </w:r>
+      <w:r>
+        <w:t xml:space="preserve"> </w:t>
+      </w:r>
+      <w:r>
+        <w:t xml:space="preserve">→ pick a</w:t>
+      </w:r>
+      <w:r>
+        <w:t xml:space="preserve"> </w:t>
+      </w:r>
+      <w:r>
+        <w:rPr>
+          <w:b/>
+          <w:bCs/>
+        </w:rPr>
+        <w:t xml:space="preserve">Delivery</w:t>
+      </w:r>
+      <w:r>
+        <w:rPr>
+          <w:b/>
+          <w:bCs/>
+        </w:rPr>
+        <w:t xml:space="preserve"> </w:t>
+      </w:r>
+      <w:r>
+        <w:rPr>
+          <w:b/>
+          <w:bCs/>
+        </w:rPr>
+        <w:t xml:space="preserve">slot</w:t>
+      </w:r>
+      <w:r>
+        <w:t xml:space="preserve"> </w:t>
+      </w:r>
+      <w:r>
+        <w:t xml:space="preserve">→ the</w:t>
+      </w:r>
+      <w:r>
+        <w:t xml:space="preserve"> </w:t>
+      </w:r>
+      <w:r>
+        <w:rPr>
+          <w:b/>
+          <w:bCs/>
+        </w:rPr>
+        <w:t xml:space="preserve">Delivery address / directions</w:t>
+      </w:r>
+      <w:r>
+        <w:t xml:space="preserve"> </w:t>
+      </w:r>
+      <w:r>
+        <w:t xml:space="preserve">box appears → fill it →</w:t>
+      </w:r>
+      <w:r>
+        <w:t xml:space="preserve"> </w:t>
+      </w:r>
+      <w:r>
+        <w:rPr>
+          <w:i/>
+          <w:iCs/>
+        </w:rPr>
+        <w:t xml:space="preserve">Seat &amp; open order</w:t>
+      </w:r>
+      <w:r>
+        <w:t xml:space="preserve">.</w:t>
+      </w:r>
+    </w:p>
+    <w:p>
+      <w:pPr>
+        <w:pStyle w:val="Compact"/>
+        <w:numPr>
+          <w:ilvl w:val="0"/>
+          <w:numId w:val="1013"/>
+        </w:numPr>
+      </w:pPr>
+      <w:r>
+        <w:t xml:space="preserve">Ring the dishes and</w:t>
+      </w:r>
+      <w:r>
+        <w:t xml:space="preserve"> </w:t>
+      </w:r>
+      <w:r>
+        <w:rPr>
+          <w:b/>
+          <w:bCs/>
+        </w:rPr>
+        <w:t xml:space="preserve">Order</w:t>
+      </w:r>
+      <w:r>
+        <w:t xml:space="preserve"> </w:t>
+      </w:r>
+      <w:r>
+        <w:t xml:space="preserve">them as usual. The kitchen ticket shows the</w:t>
+      </w:r>
+      <w:r>
+        <w:t xml:space="preserve"> </w:t>
+      </w:r>
+      <w:r>
+        <w:t xml:space="preserve">customer’s name, phone and address, and the slot number.</w:t>
+      </w:r>
+    </w:p>
+    <w:p>
+      <w:pPr>
+        <w:pStyle w:val="Compact"/>
+        <w:numPr>
+          <w:ilvl w:val="0"/>
+          <w:numId w:val="1013"/>
         </w:numPr>
       </w:pPr>
       <w:r>
@@ -5804,6 +5951,9 @@
     </w:lvlOverride>
   </w:num>
   <w:num w:numId="1007">
+    <w:abstractNumId w:val="991"/>
+  </w:num>
+  <w:num w:numId="1008">
     <w:abstractNumId w:val="99411"/>
     <w:lvlOverride w:ilvl="0">
       <w:startOverride w:val="1"/>
@@ -5833,38 +5983,8 @@
       <w:startOverride w:val="1"/>
     </w:lvlOverride>
   </w:num>
-  <w:num w:numId="1008">
+  <w:num w:numId="1009">
     <w:abstractNumId w:val="991"/>
-  </w:num>
-  <w:num w:numId="1009">
-    <w:abstractNumId w:val="99411"/>
-    <w:lvlOverride w:ilvl="0">
-      <w:startOverride w:val="1"/>
-    </w:lvlOverride>
-    <w:lvlOverride w:ilvl="1">
-      <w:startOverride w:val="1"/>
-    </w:lvlOverride>
-    <w:lvlOverride w:ilvl="2">
-      <w:startOverride w:val="1"/>
-    </w:lvlOverride>
-    <w:lvlOverride w:ilvl="3">
-      <w:startOverride w:val="1"/>
-    </w:lvlOverride>
-    <w:lvlOverride w:ilvl="4">
-      <w:startOverride w:val="1"/>
-    </w:lvlOverride>
-    <w:lvlOverride w:ilvl="5">
-      <w:startOverride w:val="1"/>
-    </w:lvlOverride>
-    <w:lvlOverride w:ilvl="6">
-      <w:startOverride w:val="1"/>
-    </w:lvlOverride>
-    <w:lvlOverride w:ilvl="7">
-      <w:startOverride w:val="1"/>
-    </w:lvlOverride>
-    <w:lvlOverride w:ilvl="8">
-      <w:startOverride w:val="1"/>
-    </w:lvlOverride>
   </w:num>
   <w:num w:numId="1010">
     <w:abstractNumId w:val="99411"/>
@@ -5927,6 +6047,36 @@
     </w:lvlOverride>
   </w:num>
   <w:num w:numId="1012">
+    <w:abstractNumId w:val="99411"/>
+    <w:lvlOverride w:ilvl="0">
+      <w:startOverride w:val="1"/>
+    </w:lvlOverride>
+    <w:lvlOverride w:ilvl="1">
+      <w:startOverride w:val="1"/>
+    </w:lvlOverride>
+    <w:lvlOverride w:ilvl="2">
+      <w:startOverride w:val="1"/>
+    </w:lvlOverride>
+    <w:lvlOverride w:ilvl="3">
+      <w:startOverride w:val="1"/>
+    </w:lvlOverride>
+    <w:lvlOverride w:ilvl="4">
+      <w:startOverride w:val="1"/>
+    </w:lvlOverride>
+    <w:lvlOverride w:ilvl="5">
+      <w:startOverride w:val="1"/>
+    </w:lvlOverride>
+    <w:lvlOverride w:ilvl="6">
+      <w:startOverride w:val="1"/>
+    </w:lvlOverride>
+    <w:lvlOverride w:ilvl="7">
+      <w:startOverride w:val="1"/>
+    </w:lvlOverride>
+    <w:lvlOverride w:ilvl="8">
+      <w:startOverride w:val="1"/>
+    </w:lvlOverride>
+  </w:num>
+  <w:num w:numId="1013">
     <w:abstractNumId w:val="99411"/>
     <w:lvlOverride w:ilvl="0">
       <w:startOverride w:val="1"/>

</xml_diff>

<commit_message>
docs: finding twenty-five — the pad's + is a seating door
</commit_message>
<xml_diff>
--- a/docs/Etham-Admin-Guide.docx
+++ b/docs/Etham-Admin-Guide.docx
@@ -3829,19 +3829,53 @@
         <w:t xml:space="preserve"> </w:t>
       </w:r>
       <w:r>
-        <w:t xml:space="preserve">Typing a name into the</w:t>
-      </w:r>
-      <w:r>
-        <w:t xml:space="preserve"> </w:t>
-      </w:r>
-      <w:r>
-        <w:t xml:space="preserve">pad’s customer box attaches nothing the floor can count — no covers, no waiter — and</w:t>
-      </w:r>
-      <w:r>
-        <w:t xml:space="preserve"> </w:t>
-      </w:r>
-      <w:r>
-        <w:t xml:space="preserve">the floor clears such leftovers by itself.</w:t>
+        <w:t xml:space="preserve">The pad’s</w:t>
+      </w:r>
+      <w:r>
+        <w:t xml:space="preserve"> </w:t>
+      </w:r>
+      <w:r>
+        <w:rPr>
+          <w:b/>
+          <w:bCs/>
+        </w:rPr>
+        <w:t xml:space="preserve">+</w:t>
+      </w:r>
+      <w:r>
+        <w:t xml:space="preserve"> </w:t>
+      </w:r>
+      <w:r>
+        <w:t xml:space="preserve">(top left)</w:t>
+      </w:r>
+      <w:r>
+        <w:t xml:space="preserve"> </w:t>
+      </w:r>
+      <w:r>
+        <w:t xml:space="preserve">is the same door: it asks the waiter’s PIN, then opens Seat guest already set to that</w:t>
+      </w:r>
+      <w:r>
+        <w:t xml:space="preserve"> </w:t>
+      </w:r>
+      <w:r>
+        <w:t xml:space="preserve">table with the seats left, and the new party’s check appears in the pad. So can a dish</w:t>
+      </w:r>
+      <w:r>
+        <w:t xml:space="preserve"> </w:t>
+      </w:r>
+      <w:r>
+        <w:t xml:space="preserve">tapped when no check is selected. Typing a name into the pad’s customer box attaches</w:t>
+      </w:r>
+      <w:r>
+        <w:t xml:space="preserve"> </w:t>
+      </w:r>
+      <w:r>
+        <w:t xml:space="preserve">nothing the floor can count — no covers, no waiter — and the floor clears such</w:t>
+      </w:r>
+      <w:r>
+        <w:t xml:space="preserve"> </w:t>
+      </w:r>
+      <w:r>
+        <w:t xml:space="preserve">leftovers by itself.</w:t>
       </w:r>
     </w:p>
     <w:p>

</xml_diff>

<commit_message>
docs: finding twenty-six — the close that hid an unpaid check
</commit_message>
<xml_diff>
--- a/docs/Etham-Admin-Guide.docx
+++ b/docs/Etham-Admin-Guide.docx
@@ -594,7 +594,51 @@
         <w:t xml:space="preserve"> </w:t>
       </w:r>
       <w:r>
-        <w:t xml:space="preserve">waiter’s tables and any party still marked seated.</w:t>
+        <w:t xml:space="preserve">waiter’s tables and any party still marked seated. If you</w:t>
+      </w:r>
+      <w:r>
+        <w:t xml:space="preserve"> </w:t>
+      </w:r>
+      <w:r>
+        <w:rPr>
+          <w:b/>
+          <w:bCs/>
+        </w:rPr>
+        <w:t xml:space="preserve">close anyway</w:t>
+      </w:r>
+      <w:r>
+        <w:t xml:space="preserve"> </w:t>
+      </w:r>
+      <w:r>
+        <w:t xml:space="preserve">with checks open, the day closes and the message names each unpaid check</w:t>
+      </w:r>
+      <w:r>
+        <w:t xml:space="preserve"> </w:t>
+      </w:r>
+      <w:r>
+        <w:t xml:space="preserve">(table, guest, amount): settle it, or</w:t>
+      </w:r>
+      <w:r>
+        <w:t xml:space="preserve"> </w:t>
+      </w:r>
+      <w:r>
+        <w:rPr>
+          <w:b/>
+          <w:bCs/>
+        </w:rPr>
+        <w:t xml:space="preserve">Release</w:t>
+      </w:r>
+      <w:r>
+        <w:t xml:space="preserve"> </w:t>
+      </w:r>
+      <w:r>
+        <w:t xml:space="preserve">the table to void it. An</w:t>
+      </w:r>
+      <w:r>
+        <w:t xml:space="preserve"> </w:t>
+      </w:r>
+      <w:r>
+        <w:t xml:space="preserve">unpaid check is never voided by the close itself.</w:t>
       </w:r>
     </w:p>
     <w:p>

</xml_diff>

<commit_message>
docs: finding twenty-nine — one bill, two M-Pesa transactions
</commit_message>
<xml_diff>
--- a/docs/Etham-Admin-Guide.docx
+++ b/docs/Etham-Admin-Guide.docx
@@ -3766,6 +3766,64 @@
       </w:r>
       <w:r>
         <w:t xml:space="preserve">already paid another bill, and prints it on the receipt.</w:t>
+      </w:r>
+      <w:r>
+        <w:t xml:space="preserve"> </w:t>
+      </w:r>
+      <w:r>
+        <w:rPr>
+          <w:b/>
+          <w:bCs/>
+        </w:rPr>
+        <w:t xml:space="preserve">Paid in two or more</w:t>
+      </w:r>
+      <w:r>
+        <w:rPr>
+          <w:b/>
+          <w:bCs/>
+        </w:rPr>
+        <w:t xml:space="preserve"> </w:t>
+      </w:r>
+      <w:r>
+        <w:rPr>
+          <w:b/>
+          <w:bCs/>
+        </w:rPr>
+        <w:t xml:space="preserve">transactions?</w:t>
+      </w:r>
+      <w:r>
+        <w:t xml:space="preserve"> </w:t>
+      </w:r>
+      <w:r>
+        <w:t xml:space="preserve">Tap</w:t>
+      </w:r>
+      <w:r>
+        <w:t xml:space="preserve"> </w:t>
+      </w:r>
+      <w:r>
+        <w:rPr>
+          <w:b/>
+          <w:bCs/>
+        </w:rPr>
+        <w:t xml:space="preserve">+ another M-Pesa payment</w:t>
+      </w:r>
+      <w:r>
+        <w:t xml:space="preserve"> </w:t>
+      </w:r>
+      <w:r>
+        <w:t xml:space="preserve">and enter each amount with its</w:t>
+      </w:r>
+      <w:r>
+        <w:t xml:space="preserve"> </w:t>
+      </w:r>
+      <w:r>
+        <w:t xml:space="preserve">own code; the amounts must add up, and each lands as its own line on the</w:t>
+      </w:r>
+      <w:r>
+        <w:t xml:space="preserve"> </w:t>
+      </w:r>
+      <w:r>
+        <w:t xml:space="preserve">receipt and in the M-Pesa Payments report.</w:t>
       </w:r>
     </w:p>
     <w:p>

</xml_diff>

<commit_message>
feat(menu): ensure dishes added to the menu are treated as non-stock items
</commit_message>
<xml_diff>
--- a/docs/Etham-Admin-Guide.docx
+++ b/docs/Etham-Admin-Guide.docx
@@ -1266,6 +1266,64 @@
       </w:r>
       <w:r>
         <w:t xml:space="preserve">on a card takes it off the menu (the item’s sales history stays).</w:t>
+      </w:r>
+    </w:p>
+    <w:p>
+      <w:pPr>
+        <w:pStyle w:val="BlockText"/>
+      </w:pPr>
+      <w:r>
+        <w:t xml:space="preserve">Adding a dish from the back-office</w:t>
+      </w:r>
+      <w:r>
+        <w:t xml:space="preserve"> </w:t>
+      </w:r>
+      <w:r>
+        <w:rPr>
+          <w:b/>
+          <w:bCs/>
+        </w:rPr>
+        <w:t xml:space="preserve">Item</w:t>
+      </w:r>
+      <w:r>
+        <w:t xml:space="preserve"> </w:t>
+      </w:r>
+      <w:r>
+        <w:t xml:space="preserve">form instead? Fine — the moment it joins</w:t>
+      </w:r>
+      <w:r>
+        <w:t xml:space="preserve"> </w:t>
+      </w:r>
+      <w:r>
+        <w:t xml:space="preserve">the menu,</w:t>
+      </w:r>
+      <w:r>
+        <w:t xml:space="preserve"> </w:t>
+      </w:r>
+      <w:r>
+        <w:rPr>
+          <w:i/>
+          <w:iCs/>
+        </w:rPr>
+        <w:t xml:space="preserve">Maintain Stock</w:t>
+      </w:r>
+      <w:r>
+        <w:t xml:space="preserve"> </w:t>
+      </w:r>
+      <w:r>
+        <w:t xml:space="preserve">is switched off for it, because dishes sell as recipes,</w:t>
+      </w:r>
+      <w:r>
+        <w:t xml:space="preserve"> </w:t>
+      </w:r>
+      <w:r>
+        <w:t xml:space="preserve">not from a warehouse count. A stocked item with nothing received cannot be sold at</w:t>
+      </w:r>
+      <w:r>
+        <w:t xml:space="preserve"> </w:t>
+      </w:r>
+      <w:r>
+        <w:t xml:space="preserve">the till; ingredients (which do carry stock) are never touched by this.</w:t>
       </w:r>
     </w:p>
     <w:p>

</xml_diff>